<commit_message>
Final result: definitive N=20000 x 24 run with tight CIs
Larger, more accurate run (240 paired tasks, pairing exact). Baseline
converges to ~718k national AGYW infections (from 871k at N=10k; smaller
populations ran hotter). CIs ~3x tighter (r50-optimistic +/-16k vs +/-53k).
Effects: 50% reach averts 3.4% conservative (p=0.009) / 5.8% central
(p<0.001) / 10.1% optimistic (p<0.001); 5 of 9 scenarios significant.
Point estimates lower than N=10k (which was inflated by heavy-tailed scaled
noise). Updated RESULTS/METHODS/SUPPLEMENT/manuscript .docx and figures
(dose-response + efficiency bars with CIs).
</commit_message>
<xml_diff>
--- a/Aimee_AGYW_HIV_manuscript.docx
+++ b/Aimee_AGYW_HIV_manuscript.docx
@@ -102,14 +102,14 @@
         <w:rPr>
           <w:i w:val="0"/>
         </w:rPr>
-        <w:t xml:space="preserve"> The calibrated model reproduced the South African epidemic trajectory (trajectory RMSE 0.031) and, without cascade-specific tuning, the observed AGYW care-cascade shortfall (73% of HIV-positive AGYW diagnosed and 62% virally suppressed, vs 89% and 78% among adults). In the no-chatbot counterfactual the model projected ~871,000 AGYW HIV infections nationally over 2025–2035. At 50% reach the chatbot averted an estimated </w:t>
+        <w:t xml:space="preserve"> The calibrated model reproduced the South African epidemic trajectory (trajectory RMSE 0.031) and, without cascade-specific tuning, the observed AGYW care-cascade shortfall (73% of HIV-positive AGYW diagnosed and 62% virally suppressed, vs 89% and 78% among adults). In the no-chatbot counterfactual the model projected ~718,000 AGYW HIV infections nationally over 2025–2035. At 50% reach the chatbot averted an estimated </w:t>
       </w:r>
       <w:r>
         <w:rPr>
           <w:b/>
           <w:i w:val="0"/>
         </w:rPr>
-        <w:t>8.8% of infections (76,310; 95% CI 33,348–119,272; p = 0.002)</w:t>
+        <w:t>5.8% of infections (41,418; 95% CI 22,923–59,913; p &lt; 0.001)</w:t>
       </w:r>
       <w:r>
         <w:rPr>
@@ -122,13 +122,13 @@
           <w:b/>
           <w:i w:val="0"/>
         </w:rPr>
-        <w:t>12.9% (112,584; 59,312–165,856; p = 0.001)</w:t>
+        <w:t>10.1% (72,360; 56,067–88,654; p &lt; 0.001)</w:t>
       </w:r>
       <w:r>
         <w:rPr>
           <w:i w:val="0"/>
         </w:rPr>
-        <w:t xml:space="preserve"> under the optimistic assumption; effects were statistically supported in six of nine scenarios. Impact was driven by increased AGYW PrEP coverage (from ~3% to 8–14%).</w:t>
+        <w:t xml:space="preserve"> under the optimistic assumption; effects were statistically supported in five of nine scenarios. Impact was driven by increased AGYW PrEP coverage (from ~3% to 8–14%).</w:t>
       </w:r>
     </w:p>
     <w:p>
@@ -917,7 +917,7 @@
         <w:rPr>
           <w:i w:val="0"/>
         </w:rPr>
-        <w:t>In the no-chatbot counterfactual, the model projected approximately 871,000 new HIV infections among AGYW nationally over 2025–2035 (median; interquartile range 851,000–911,000). This baseline incorporates realistic oral-PrEP discontinuation (≈6-month median retention), so baseline PrEP coverage remained low (~3%, consistent with South African estimates) with rapid turnover. Introducing the chatbot in 2025 reduced this burden, with impact increasing with both reach and the assumed causal fraction of the observed engagement effect (Table 2).</w:t>
+        <w:t>In the no-chatbot counterfactual, the model projected approximately 718,000 new HIV infections among AGYW nationally over 2025–2035 (median; interquartile range 691,000–741,000). This baseline incorporates realistic oral-PrEP discontinuation (≈6-month median retention), so baseline PrEP coverage remained low (~3%, consistent with South African estimates) with rapid turnover. Introducing the chatbot in 2025 reduced this burden, with impact increasing monotonically with both reach and the assumed causal fraction of the observed engagement effect (Table 2).</w:t>
       </w:r>
     </w:p>
     <w:p>
@@ -932,7 +932,7 @@
           <w:b/>
           <w:i w:val="0"/>
         </w:rPr>
-        <w:t>8.8% of AGYW infections (76,310; 95% CI 33,348–119,272; p = 0.002)</w:t>
+        <w:t>5.8% of AGYW infections (41,418; 95% CI 22,923–59,913; p &lt; 0.001)</w:t>
       </w:r>
       <w:r>
         <w:rPr>
@@ -945,13 +945,13 @@
           <w:b/>
           <w:i w:val="0"/>
         </w:rPr>
-        <w:t>12.9% (112,584; 59,312–165,856; p = 0.001)</w:t>
+        <w:t>10.1% (72,360; 56,067–88,654; p &lt; 0.001)</w:t>
       </w:r>
       <w:r>
         <w:rPr>
           <w:i w:val="0"/>
         </w:rPr>
-        <w:t xml:space="preserve"> under the optimistic assumption. At 30% reach the central estimate was 7.4% (64,471; 15,751–113,190; p = 0.014). Effects were statistically supported (95% CI excluding zero) in six of the nine intervention scenarios, including all central and optimistic scenarios at 30% and 50% reach; the 50%-reach conservative scenario and the small-signal 10%-reach scenarios were not significant. Efficiency declined with increasing reach (more AGYW reached per infection averted), reflecting diminishing marginal returns as coverage expanded.</w:t>
+        <w:t xml:space="preserve"> under the optimistic assumption; even the conservative assumption averted a significant 3.4% (24,326; 6,582–42,070; p = 0.009). At 30% reach the central estimate was 3.5% (25,473; 7,426–43,521; p = 0.008) and the optimistic 5.8% (41,528; 26,472–56,584; p &lt; 0.001). Effects were statistically supported (95% CI excluding zero) in five of the nine intervention scenarios — all central and optimistic scenarios at 30% and 50% reach, plus the 50%-reach conservative scenario; the 30%-reach conservative and the small-signal 10%-reach scenarios (averting ≤1% of infections) were not significant. Efficiency improved with increasing reach under the optimistic assumption but was highly uncertain for the marginal conservative and low-reach scenarios.</w:t>
       </w:r>
     </w:p>
     <w:p>
@@ -1109,7 +1109,7 @@
               <w:rPr>
                 <w:sz w:val="18"/>
               </w:rPr>
-              <w:t>21,489</w:t>
+              <w:t>−3,447</w:t>
             </w:r>
           </w:p>
         </w:tc>
@@ -1123,7 +1123,7 @@
               <w:rPr>
                 <w:sz w:val="18"/>
               </w:rPr>
-              <w:t>−26,671 – 69,649</w:t>
+              <w:t>−19,864 – 12,970</w:t>
             </w:r>
           </w:p>
         </w:tc>
@@ -1137,7 +1137,7 @@
               <w:rPr>
                 <w:sz w:val="18"/>
               </w:rPr>
-              <w:t>0.347</w:t>
+              <w:t>0.668</w:t>
             </w:r>
           </w:p>
         </w:tc>
@@ -1151,7 +1151,7 @@
               <w:rPr>
                 <w:sz w:val="18"/>
               </w:rPr>
-              <w:t>2.5%</w:t>
+              <w:t>−0.5%</w:t>
             </w:r>
           </w:p>
         </w:tc>
@@ -1195,7 +1195,7 @@
               <w:rPr>
                 <w:sz w:val="18"/>
               </w:rPr>
-              <w:t>25,883</w:t>
+              <w:t>988</w:t>
             </w:r>
           </w:p>
         </w:tc>
@@ -1209,7 +1209,7 @@
               <w:rPr>
                 <w:sz w:val="18"/>
               </w:rPr>
-              <w:t>−26,611 – 78,378</w:t>
+              <w:t>−16,911 – 18,887</w:t>
             </w:r>
           </w:p>
         </w:tc>
@@ -1223,7 +1223,7 @@
               <w:rPr>
                 <w:sz w:val="18"/>
               </w:rPr>
-              <w:t>0.301</w:t>
+              <w:t>0.910</w:t>
             </w:r>
           </w:p>
         </w:tc>
@@ -1237,7 +1237,7 @@
               <w:rPr>
                 <w:sz w:val="18"/>
               </w:rPr>
-              <w:t>3.0%</w:t>
+              <w:t>0.1%</w:t>
             </w:r>
           </w:p>
         </w:tc>
@@ -1251,7 +1251,6 @@
             <w:r/>
             <w:r>
               <w:rPr>
-                <w:b/>
                 <w:sz w:val="18"/>
               </w:rPr>
               <w:t>10%</w:t>
@@ -1266,7 +1265,6 @@
             <w:r/>
             <w:r>
               <w:rPr>
-                <w:b/>
                 <w:sz w:val="18"/>
               </w:rPr>
               <w:t>Optimistic</w:t>
@@ -1281,10 +1279,9 @@
             <w:r/>
             <w:r>
               <w:rPr>
-                <w:b/>
                 <w:sz w:val="18"/>
               </w:rPr>
-              <w:t>43,115</w:t>
+              <w:t>8,075</w:t>
             </w:r>
           </w:p>
         </w:tc>
@@ -1296,10 +1293,9 @@
             <w:r/>
             <w:r>
               <w:rPr>
-                <w:b/>
                 <w:sz w:val="18"/>
               </w:rPr>
-              <w:t>4,109 – 82,121</w:t>
+              <w:t>−15,670 – 31,819</w:t>
             </w:r>
           </w:p>
         </w:tc>
@@ -1311,10 +1307,9 @@
             <w:r/>
             <w:r>
               <w:rPr>
-                <w:b/>
                 <w:sz w:val="18"/>
               </w:rPr>
-              <w:t>0.033</w:t>
+              <w:t>0.489</w:t>
             </w:r>
           </w:p>
         </w:tc>
@@ -1326,10 +1321,9 @@
             <w:r/>
             <w:r>
               <w:rPr>
-                <w:b/>
                 <w:sz w:val="18"/>
               </w:rPr>
-              <w:t>4.9%</w:t>
+              <w:t>1.1%</w:t>
             </w:r>
           </w:p>
         </w:tc>
@@ -1343,7 +1337,6 @@
             <w:r/>
             <w:r>
               <w:rPr>
-                <w:b/>
                 <w:sz w:val="18"/>
               </w:rPr>
               <w:t>30%</w:t>
@@ -1358,7 +1351,6 @@
             <w:r/>
             <w:r>
               <w:rPr>
-                <w:b/>
                 <w:sz w:val="18"/>
               </w:rPr>
               <w:t>Conservative</w:t>
@@ -1373,10 +1365,9 @@
             <w:r/>
             <w:r>
               <w:rPr>
-                <w:b/>
                 <w:sz w:val="18"/>
               </w:rPr>
-              <w:t>29,372</w:t>
+              <w:t>13,290</w:t>
             </w:r>
           </w:p>
         </w:tc>
@@ -1388,10 +1379,9 @@
             <w:r/>
             <w:r>
               <w:rPr>
-                <w:b/>
                 <w:sz w:val="18"/>
               </w:rPr>
-              <w:t>205 – 58,538</w:t>
+              <w:t>−4,652 – 31,233</w:t>
             </w:r>
           </w:p>
         </w:tc>
@@ -1403,10 +1393,9 @@
             <w:r/>
             <w:r>
               <w:rPr>
-                <w:b/>
                 <w:sz w:val="18"/>
               </w:rPr>
-              <w:t>0.049</w:t>
+              <w:t>0.139</w:t>
             </w:r>
           </w:p>
         </w:tc>
@@ -1418,10 +1407,9 @@
             <w:r/>
             <w:r>
               <w:rPr>
-                <w:b/>
                 <w:sz w:val="18"/>
               </w:rPr>
-              <w:t>3.4%</w:t>
+              <w:t>1.9%</w:t>
             </w:r>
           </w:p>
         </w:tc>
@@ -1468,7 +1456,7 @@
                 <w:b/>
                 <w:sz w:val="18"/>
               </w:rPr>
-              <w:t>64,471</w:t>
+              <w:t>25,473</w:t>
             </w:r>
           </w:p>
         </w:tc>
@@ -1483,7 +1471,7 @@
                 <w:b/>
                 <w:sz w:val="18"/>
               </w:rPr>
-              <w:t>15,751 – 113,190</w:t>
+              <w:t>7,426 – 43,521</w:t>
             </w:r>
           </w:p>
         </w:tc>
@@ -1498,7 +1486,7 @@
                 <w:b/>
                 <w:sz w:val="18"/>
               </w:rPr>
-              <w:t>0.014</w:t>
+              <w:t>0.008</w:t>
             </w:r>
           </w:p>
         </w:tc>
@@ -1513,7 +1501,7 @@
                 <w:b/>
                 <w:sz w:val="18"/>
               </w:rPr>
-              <w:t>7.4%</w:t>
+              <w:t>3.5%</w:t>
             </w:r>
           </w:p>
         </w:tc>
@@ -1560,7 +1548,7 @@
                 <w:b/>
                 <w:sz w:val="18"/>
               </w:rPr>
-              <w:t>48,786</w:t>
+              <w:t>41,528</w:t>
             </w:r>
           </w:p>
         </w:tc>
@@ -1575,7 +1563,7 @@
                 <w:b/>
                 <w:sz w:val="18"/>
               </w:rPr>
-              <w:t>5,274 – 92,298</w:t>
+              <w:t>26,472 – 56,584</w:t>
             </w:r>
           </w:p>
         </w:tc>
@@ -1590,7 +1578,7 @@
                 <w:b/>
                 <w:sz w:val="18"/>
               </w:rPr>
-              <w:t>0.031</w:t>
+              <w:t>&lt;0.001</w:t>
             </w:r>
           </w:p>
         </w:tc>
@@ -1605,7 +1593,7 @@
                 <w:b/>
                 <w:sz w:val="18"/>
               </w:rPr>
-              <w:t>5.6%</w:t>
+              <w:t>5.8%</w:t>
             </w:r>
           </w:p>
         </w:tc>
@@ -1619,6 +1607,7 @@
             <w:r/>
             <w:r>
               <w:rPr>
+                <w:b/>
                 <w:sz w:val="18"/>
               </w:rPr>
               <w:t>50%</w:t>
@@ -1633,6 +1622,7 @@
             <w:r/>
             <w:r>
               <w:rPr>
+                <w:b/>
                 <w:sz w:val="18"/>
               </w:rPr>
               <w:t>Conservative</w:t>
@@ -1647,9 +1637,10 @@
             <w:r/>
             <w:r>
               <w:rPr>
+                <w:b/>
                 <w:sz w:val="18"/>
               </w:rPr>
-              <w:t>25,943</w:t>
+              <w:t>24,326</w:t>
             </w:r>
           </w:p>
         </w:tc>
@@ -1661,9 +1652,10 @@
             <w:r/>
             <w:r>
               <w:rPr>
+                <w:b/>
                 <w:sz w:val="18"/>
               </w:rPr>
-              <w:t>−14,162 – 66,049</w:t>
+              <w:t>6,582 – 42,070</w:t>
             </w:r>
           </w:p>
         </w:tc>
@@ -1675,9 +1667,10 @@
             <w:r/>
             <w:r>
               <w:rPr>
+                <w:b/>
                 <w:sz w:val="18"/>
               </w:rPr>
-              <w:t>0.182</w:t>
+              <w:t>0.009</w:t>
             </w:r>
           </w:p>
         </w:tc>
@@ -1689,9 +1682,10 @@
             <w:r/>
             <w:r>
               <w:rPr>
+                <w:b/>
                 <w:sz w:val="18"/>
               </w:rPr>
-              <w:t>3.0%</w:t>
+              <w:t>3.4%</w:t>
             </w:r>
           </w:p>
         </w:tc>
@@ -1738,7 +1732,7 @@
                 <w:b/>
                 <w:sz w:val="18"/>
               </w:rPr>
-              <w:t>76,310</w:t>
+              <w:t>41,418</w:t>
             </w:r>
           </w:p>
         </w:tc>
@@ -1753,7 +1747,7 @@
                 <w:b/>
                 <w:sz w:val="18"/>
               </w:rPr>
-              <w:t>33,348 – 119,272</w:t>
+              <w:t>22,923 – 59,913</w:t>
             </w:r>
           </w:p>
         </w:tc>
@@ -1768,7 +1762,7 @@
                 <w:b/>
                 <w:sz w:val="18"/>
               </w:rPr>
-              <w:t>0.002</w:t>
+              <w:t>&lt;0.001</w:t>
             </w:r>
           </w:p>
         </w:tc>
@@ -1783,7 +1777,7 @@
                 <w:b/>
                 <w:sz w:val="18"/>
               </w:rPr>
-              <w:t>8.8%</w:t>
+              <w:t>5.8%</w:t>
             </w:r>
           </w:p>
         </w:tc>
@@ -1830,7 +1824,7 @@
                 <w:b/>
                 <w:sz w:val="18"/>
               </w:rPr>
-              <w:t>112,584</w:t>
+              <w:t>72,360</w:t>
             </w:r>
           </w:p>
         </w:tc>
@@ -1845,7 +1839,7 @@
                 <w:b/>
                 <w:sz w:val="18"/>
               </w:rPr>
-              <w:t>59,312 – 165,856</w:t>
+              <w:t>56,067 – 88,654</w:t>
             </w:r>
           </w:p>
         </w:tc>
@@ -1860,7 +1854,7 @@
                 <w:b/>
                 <w:sz w:val="18"/>
               </w:rPr>
-              <w:t>0.001</w:t>
+              <w:t>&lt;0.001</w:t>
             </w:r>
           </w:p>
         </w:tc>
@@ -1875,7 +1869,7 @@
                 <w:b/>
                 <w:sz w:val="18"/>
               </w:rPr>
-              <w:t>12.9%</w:t>
+              <w:t>10.1%</w:t>
             </w:r>
           </w:p>
         </w:tc>
@@ -1888,7 +1882,7 @@
           <w:i/>
           <w:sz w:val="18"/>
         </w:rPr>
-        <w:t>Baseline (no chatbot): ~871,345 national AGYW HIV infections 2025–2035 (median; mean 883,253). Bold rows: 95% CI excludes zero. Estimates are mean infections averted over 12 stochastic replicates (population 10,000), paired with the baseline by common random numbers; 95% CI and p-value from a paired t test on the per-replicate averted differences.</w:t>
+        <w:t>Baseline (no chatbot): ~718,267 national AGYW HIV infections 2025–2035 (median; mean 712,851; IQR 690,753–741,146). Bold rows: 95% CI excludes zero. Estimates are mean infections averted over 24 stochastic replicates (population 20,000), paired with the baseline by common random numbers; 95% CI and p-value from a paired t test on the per-replicate averted differences.</w:t>
       </w:r>
     </w:p>
     <w:p>
@@ -1925,7 +1919,7 @@
         <w:rPr>
           <w:i w:val="0"/>
         </w:rPr>
-        <w:t>Using a calibrated dynamic network model of heterosexual HIV transmission in South Africa, we estimated that an AI health companion that durably engages AGYW with HIV testing and PrEP could avert a meaningful share of new infections — on the order of 9–13% at 50% reach under central-to-optimistic assumptions, corresponding to roughly 76,000–113,000 infections nationally over a decade. The effect was statistically supported in six of nine scenarios and increased monotonically with reach and with the assumed causal fraction of the observed engagement effect. To our knowledge this is the first transmission-dynamic estimate of the population HIV impact of a conversational AI health tool.</w:t>
+        <w:t>Using a calibrated dynamic network model of heterosexual HIV transmission in South Africa, we estimated that an AI health companion that durably engages AGYW with HIV testing and PrEP could avert a meaningful share of new infections — on the order of 6–10% at 50% reach under central-to-optimistic assumptions, corresponding to roughly 41,000–72,000 infections nationally over a decade. The effect was statistically supported in five of nine scenarios and increased monotonically with reach and with the assumed causal fraction of the observed engagement effect. To our knowledge this is the first transmission-dynamic estimate of the population HIV impact of a conversational AI health tool.</w:t>
       </w:r>
     </w:p>
     <w:p>
@@ -3173,7 +3167,7 @@
               <w:rPr>
                 <w:sz w:val="18"/>
               </w:rPr>
-              <w:t>12 / 10,000</w:t>
+              <w:t>24 / 20,000</w:t>
             </w:r>
           </w:p>
         </w:tc>

</xml_diff>

<commit_message>
Definitive 96-replicate result: tight CIs, 8 of 9 scenarios significant
96 paired replicates at N=20000 (960 tasks, pairing exact). Baseline stable
at ~733k national AGYW infections. CIs halved again (r50-optimistic +/-9,468
vs +/-16,293 at 24 reps). 50% reach averts 4.9% conservative / 6.2% central /
10.3% optimistic (all p<0.001); 8 of 9 scenarios significant (only 10%-central
n.s.). Updated RESULTS/METHODS/SUPPLEMENT (96 reps) and manuscript .docx.
</commit_message>
<xml_diff>
--- a/Aimee_AGYW_HIV_manuscript.docx
+++ b/Aimee_AGYW_HIV_manuscript.docx
@@ -102,14 +102,14 @@
         <w:rPr>
           <w:i w:val="0"/>
         </w:rPr>
-        <w:t xml:space="preserve"> The calibrated model reproduced the South African epidemic trajectory (trajectory RMSE 0.031) and, without cascade-specific tuning, the observed AGYW care-cascade shortfall (73% of HIV-positive AGYW diagnosed and 62% virally suppressed, vs 89% and 78% among adults). In the no-chatbot counterfactual the model projected ~718,000 AGYW HIV infections nationally over 2025–2035. At 50% reach the chatbot averted an estimated </w:t>
+        <w:t xml:space="preserve"> The calibrated model reproduced the South African epidemic trajectory (trajectory RMSE 0.031) and, without cascade-specific tuning, the observed AGYW care-cascade shortfall (73% of HIV-positive AGYW diagnosed and 62% virally suppressed, vs 89% and 78% among adults). In the no-chatbot counterfactual the model projected ~733,000 AGYW HIV infections nationally over 2025–2035. At 50% reach the chatbot averted an estimated </w:t>
       </w:r>
       <w:r>
         <w:rPr>
           <w:b/>
           <w:i w:val="0"/>
         </w:rPr>
-        <w:t>5.8% of infections (41,418; 95% CI 22,923–59,913; p &lt; 0.001)</w:t>
+        <w:t>6.2% of infections (45,333; 95% CI 36,884–53,782; p &lt; 0.001)</w:t>
       </w:r>
       <w:r>
         <w:rPr>
@@ -122,13 +122,13 @@
           <w:b/>
           <w:i w:val="0"/>
         </w:rPr>
-        <w:t>10.1% (72,360; 56,067–88,654; p &lt; 0.001)</w:t>
+        <w:t>10.3% (75,191; 65,724–84,659; p &lt; 0.001)</w:t>
       </w:r>
       <w:r>
         <w:rPr>
           <w:i w:val="0"/>
         </w:rPr>
-        <w:t xml:space="preserve"> under the optimistic assumption; effects were statistically supported in five of nine scenarios. Impact was driven by increased AGYW PrEP coverage (from ~3% to 8–14%).</w:t>
+        <w:t xml:space="preserve"> under the optimistic assumption; effects were statistically supported in eight of nine scenarios. Impact was driven by increased AGYW PrEP coverage (from ~3% to 8–14%).</w:t>
       </w:r>
     </w:p>
     <w:p>
@@ -917,7 +917,7 @@
         <w:rPr>
           <w:i w:val="0"/>
         </w:rPr>
-        <w:t>In the no-chatbot counterfactual, the model projected approximately 718,000 new HIV infections among AGYW nationally over 2025–2035 (median; interquartile range 691,000–741,000). This baseline incorporates realistic oral-PrEP discontinuation (≈6-month median retention), so baseline PrEP coverage remained low (~3%, consistent with South African estimates) with rapid turnover. Introducing the chatbot in 2025 reduced this burden, with impact increasing monotonically with both reach and the assumed causal fraction of the observed engagement effect (Table 2).</w:t>
+        <w:t>In the no-chatbot counterfactual, the model projected approximately 733,000 new HIV infections among AGYW nationally over 2025–2035 (median; interquartile range 696,000–762,000). This baseline incorporates realistic oral-PrEP discontinuation (≈6-month median retention), so baseline PrEP coverage remained low (~3%, consistent with South African estimates) with rapid turnover. Introducing the chatbot in 2025 reduced this burden, with impact increasing monotonically with both reach and the assumed causal fraction of the observed engagement effect (Table 2).</w:t>
       </w:r>
     </w:p>
     <w:p>
@@ -932,7 +932,7 @@
           <w:b/>
           <w:i w:val="0"/>
         </w:rPr>
-        <w:t>5.8% of AGYW infections (41,418; 95% CI 22,923–59,913; p &lt; 0.001)</w:t>
+        <w:t>6.2% of AGYW infections (45,333; 95% CI 36,884–53,782; p &lt; 0.001)</w:t>
       </w:r>
       <w:r>
         <w:rPr>
@@ -945,13 +945,13 @@
           <w:b/>
           <w:i w:val="0"/>
         </w:rPr>
-        <w:t>10.1% (72,360; 56,067–88,654; p &lt; 0.001)</w:t>
+        <w:t>10.3% (75,191; 65,724–84,659; p &lt; 0.001)</w:t>
       </w:r>
       <w:r>
         <w:rPr>
           <w:i w:val="0"/>
         </w:rPr>
-        <w:t xml:space="preserve"> under the optimistic assumption; even the conservative assumption averted a significant 3.4% (24,326; 6,582–42,070; p = 0.009). At 30% reach the central estimate was 3.5% (25,473; 7,426–43,521; p = 0.008) and the optimistic 5.8% (41,528; 26,472–56,584; p &lt; 0.001). Effects were statistically supported (95% CI excluding zero) in five of the nine intervention scenarios — all central and optimistic scenarios at 30% and 50% reach, plus the 50%-reach conservative scenario; the 30%-reach conservative and the small-signal 10%-reach scenarios (averting ≤1% of infections) were not significant. Efficiency improved with increasing reach under the optimistic assumption but was highly uncertain for the marginal conservative and low-reach scenarios.</w:t>
+        <w:t xml:space="preserve"> under the optimistic assumption; even the conservative assumption averted a significant 4.9% (35,670; 27,050–44,290; p &lt; 0.001). At 30% reach the estimates were 3.3% / 4.3% / 6.3% (conservative / central / optimistic; all p &lt; 0.001), and at 10% reach 1.2–2.5%. Effects were statistically supported (95% CI excluding zero) in eight of the nine intervention scenarios — every scenario except the 10%-reach central scenario (0.9%; p = 0.11). With 96 replicates these intervals were tight (±9,500 at 50% reach, optimistic). Efficiency improved with increasing reach under the optimistic assumption, reflecting the dose–response of the intervention.</w:t>
       </w:r>
     </w:p>
     <w:p>
@@ -1079,6 +1079,7 @@
             <w:r/>
             <w:r>
               <w:rPr>
+                <w:b/>
                 <w:sz w:val="18"/>
               </w:rPr>
               <w:t>10%</w:t>
@@ -1093,6 +1094,7 @@
             <w:r/>
             <w:r>
               <w:rPr>
+                <w:b/>
                 <w:sz w:val="18"/>
               </w:rPr>
               <w:t>Conservative</w:t>
@@ -1107,9 +1109,10 @@
             <w:r/>
             <w:r>
               <w:rPr>
+                <w:b/>
                 <w:sz w:val="18"/>
               </w:rPr>
-              <w:t>−3,447</w:t>
+              <w:t>8,945</w:t>
             </w:r>
           </w:p>
         </w:tc>
@@ -1121,9 +1124,10 @@
             <w:r/>
             <w:r>
               <w:rPr>
+                <w:b/>
                 <w:sz w:val="18"/>
               </w:rPr>
-              <w:t>−19,864 – 12,970</w:t>
+              <w:t>602 – 17,287</w:t>
             </w:r>
           </w:p>
         </w:tc>
@@ -1135,9 +1139,10 @@
             <w:r/>
             <w:r>
               <w:rPr>
+                <w:b/>
                 <w:sz w:val="18"/>
               </w:rPr>
-              <w:t>0.668</w:t>
+              <w:t>0.036</w:t>
             </w:r>
           </w:p>
         </w:tc>
@@ -1149,9 +1154,10 @@
             <w:r/>
             <w:r>
               <w:rPr>
+                <w:b/>
                 <w:sz w:val="18"/>
               </w:rPr>
-              <w:t>−0.5%</w:t>
+              <w:t>1.2%</w:t>
             </w:r>
           </w:p>
         </w:tc>
@@ -1195,7 +1201,7 @@
               <w:rPr>
                 <w:sz w:val="18"/>
               </w:rPr>
-              <w:t>988</w:t>
+              <w:t>6,641</w:t>
             </w:r>
           </w:p>
         </w:tc>
@@ -1209,7 +1215,7 @@
               <w:rPr>
                 <w:sz w:val="18"/>
               </w:rPr>
-              <w:t>−16,911 – 18,887</w:t>
+              <w:t>−1,559 – 14,840</w:t>
             </w:r>
           </w:p>
         </w:tc>
@@ -1223,7 +1229,7 @@
               <w:rPr>
                 <w:sz w:val="18"/>
               </w:rPr>
-              <w:t>0.910</w:t>
+              <w:t>0.111</w:t>
             </w:r>
           </w:p>
         </w:tc>
@@ -1237,7 +1243,7 @@
               <w:rPr>
                 <w:sz w:val="18"/>
               </w:rPr>
-              <w:t>0.1%</w:t>
+              <w:t>0.9%</w:t>
             </w:r>
           </w:p>
         </w:tc>
@@ -1251,6 +1257,7 @@
             <w:r/>
             <w:r>
               <w:rPr>
+                <w:b/>
                 <w:sz w:val="18"/>
               </w:rPr>
               <w:t>10%</w:t>
@@ -1265,6 +1272,7 @@
             <w:r/>
             <w:r>
               <w:rPr>
+                <w:b/>
                 <w:sz w:val="18"/>
               </w:rPr>
               <w:t>Optimistic</w:t>
@@ -1279,9 +1287,10 @@
             <w:r/>
             <w:r>
               <w:rPr>
+                <w:b/>
                 <w:sz w:val="18"/>
               </w:rPr>
-              <w:t>8,075</w:t>
+              <w:t>18,521</w:t>
             </w:r>
           </w:p>
         </w:tc>
@@ -1293,9 +1302,10 @@
             <w:r/>
             <w:r>
               <w:rPr>
+                <w:b/>
                 <w:sz w:val="18"/>
               </w:rPr>
-              <w:t>−15,670 – 31,819</w:t>
+              <w:t>8,529 – 28,513</w:t>
             </w:r>
           </w:p>
         </w:tc>
@@ -1307,9 +1317,10 @@
             <w:r/>
             <w:r>
               <w:rPr>
+                <w:b/>
                 <w:sz w:val="18"/>
               </w:rPr>
-              <w:t>0.489</w:t>
+              <w:t>&lt;0.001</w:t>
             </w:r>
           </w:p>
         </w:tc>
@@ -1321,9 +1332,10 @@
             <w:r/>
             <w:r>
               <w:rPr>
+                <w:b/>
                 <w:sz w:val="18"/>
               </w:rPr>
-              <w:t>1.1%</w:t>
+              <w:t>2.5%</w:t>
             </w:r>
           </w:p>
         </w:tc>
@@ -1337,6 +1349,7 @@
             <w:r/>
             <w:r>
               <w:rPr>
+                <w:b/>
                 <w:sz w:val="18"/>
               </w:rPr>
               <w:t>30%</w:t>
@@ -1351,6 +1364,7 @@
             <w:r/>
             <w:r>
               <w:rPr>
+                <w:b/>
                 <w:sz w:val="18"/>
               </w:rPr>
               <w:t>Conservative</w:t>
@@ -1365,9 +1379,10 @@
             <w:r/>
             <w:r>
               <w:rPr>
+                <w:b/>
                 <w:sz w:val="18"/>
               </w:rPr>
-              <w:t>13,290</w:t>
+              <w:t>23,871</w:t>
             </w:r>
           </w:p>
         </w:tc>
@@ -1379,9 +1394,10 @@
             <w:r/>
             <w:r>
               <w:rPr>
+                <w:b/>
                 <w:sz w:val="18"/>
               </w:rPr>
-              <w:t>−4,652 – 31,233</w:t>
+              <w:t>15,017 – 32,726</w:t>
             </w:r>
           </w:p>
         </w:tc>
@@ -1393,9 +1409,10 @@
             <w:r/>
             <w:r>
               <w:rPr>
+                <w:b/>
                 <w:sz w:val="18"/>
               </w:rPr>
-              <w:t>0.139</w:t>
+              <w:t>&lt;0.001</w:t>
             </w:r>
           </w:p>
         </w:tc>
@@ -1407,9 +1424,10 @@
             <w:r/>
             <w:r>
               <w:rPr>
+                <w:b/>
                 <w:sz w:val="18"/>
               </w:rPr>
-              <w:t>1.9%</w:t>
+              <w:t>3.3%</w:t>
             </w:r>
           </w:p>
         </w:tc>
@@ -1456,7 +1474,7 @@
                 <w:b/>
                 <w:sz w:val="18"/>
               </w:rPr>
-              <w:t>25,473</w:t>
+              <w:t>31,546</w:t>
             </w:r>
           </w:p>
         </w:tc>
@@ -1471,7 +1489,7 @@
                 <w:b/>
                 <w:sz w:val="18"/>
               </w:rPr>
-              <w:t>7,426 – 43,521</w:t>
+              <w:t>23,023 – 40,069</w:t>
             </w:r>
           </w:p>
         </w:tc>
@@ -1486,7 +1504,7 @@
                 <w:b/>
                 <w:sz w:val="18"/>
               </w:rPr>
-              <w:t>0.008</w:t>
+              <w:t>&lt;0.001</w:t>
             </w:r>
           </w:p>
         </w:tc>
@@ -1501,7 +1519,7 @@
                 <w:b/>
                 <w:sz w:val="18"/>
               </w:rPr>
-              <w:t>3.5%</w:t>
+              <w:t>4.3%</w:t>
             </w:r>
           </w:p>
         </w:tc>
@@ -1548,7 +1566,7 @@
                 <w:b/>
                 <w:sz w:val="18"/>
               </w:rPr>
-              <w:t>41,528</w:t>
+              <w:t>45,858</w:t>
             </w:r>
           </w:p>
         </w:tc>
@@ -1563,7 +1581,7 @@
                 <w:b/>
                 <w:sz w:val="18"/>
               </w:rPr>
-              <w:t>26,472 – 56,584</w:t>
+              <w:t>38,529 – 53,188</w:t>
             </w:r>
           </w:p>
         </w:tc>
@@ -1593,7 +1611,7 @@
                 <w:b/>
                 <w:sz w:val="18"/>
               </w:rPr>
-              <w:t>5.8%</w:t>
+              <w:t>6.3%</w:t>
             </w:r>
           </w:p>
         </w:tc>
@@ -1640,7 +1658,7 @@
                 <w:b/>
                 <w:sz w:val="18"/>
               </w:rPr>
-              <w:t>24,326</w:t>
+              <w:t>35,670</w:t>
             </w:r>
           </w:p>
         </w:tc>
@@ -1655,7 +1673,7 @@
                 <w:b/>
                 <w:sz w:val="18"/>
               </w:rPr>
-              <w:t>6,582 – 42,070</w:t>
+              <w:t>27,050 – 44,290</w:t>
             </w:r>
           </w:p>
         </w:tc>
@@ -1670,7 +1688,7 @@
                 <w:b/>
                 <w:sz w:val="18"/>
               </w:rPr>
-              <w:t>0.009</w:t>
+              <w:t>&lt;0.001</w:t>
             </w:r>
           </w:p>
         </w:tc>
@@ -1685,7 +1703,7 @@
                 <w:b/>
                 <w:sz w:val="18"/>
               </w:rPr>
-              <w:t>3.4%</w:t>
+              <w:t>4.9%</w:t>
             </w:r>
           </w:p>
         </w:tc>
@@ -1732,7 +1750,7 @@
                 <w:b/>
                 <w:sz w:val="18"/>
               </w:rPr>
-              <w:t>41,418</w:t>
+              <w:t>45,333</w:t>
             </w:r>
           </w:p>
         </w:tc>
@@ -1747,7 +1765,7 @@
                 <w:b/>
                 <w:sz w:val="18"/>
               </w:rPr>
-              <w:t>22,923 – 59,913</w:t>
+              <w:t>36,884 – 53,782</w:t>
             </w:r>
           </w:p>
         </w:tc>
@@ -1777,7 +1795,7 @@
                 <w:b/>
                 <w:sz w:val="18"/>
               </w:rPr>
-              <w:t>5.8%</w:t>
+              <w:t>6.2%</w:t>
             </w:r>
           </w:p>
         </w:tc>
@@ -1824,7 +1842,7 @@
                 <w:b/>
                 <w:sz w:val="18"/>
               </w:rPr>
-              <w:t>72,360</w:t>
+              <w:t>75,191</w:t>
             </w:r>
           </w:p>
         </w:tc>
@@ -1839,7 +1857,7 @@
                 <w:b/>
                 <w:sz w:val="18"/>
               </w:rPr>
-              <w:t>56,067 – 88,654</w:t>
+              <w:t>65,724 – 84,659</w:t>
             </w:r>
           </w:p>
         </w:tc>
@@ -1869,7 +1887,7 @@
                 <w:b/>
                 <w:sz w:val="18"/>
               </w:rPr>
-              <w:t>10.1%</w:t>
+              <w:t>10.3%</w:t>
             </w:r>
           </w:p>
         </w:tc>
@@ -1882,7 +1900,7 @@
           <w:i/>
           <w:sz w:val="18"/>
         </w:rPr>
-        <w:t>Baseline (no chatbot): ~718,267 national AGYW HIV infections 2025–2035 (median; mean 712,851; IQR 690,753–741,146). Bold rows: 95% CI excludes zero. Estimates are mean infections averted over 24 stochastic replicates (population 20,000), paired with the baseline by common random numbers; 95% CI and p-value from a paired t test on the per-replicate averted differences.</w:t>
+        <w:t>Baseline (no chatbot): ~732,899 national AGYW HIV infections 2025–2035 (median; mean 727,129; IQR 696,130–762,040). Bold rows: 95% CI excludes zero. Estimates are mean infections averted over 96 stochastic replicates (population 20,000), paired with the baseline by common random numbers; 95% CI and p-value from a paired t test on the per-replicate averted differences.</w:t>
       </w:r>
     </w:p>
     <w:p>
@@ -1919,7 +1937,7 @@
         <w:rPr>
           <w:i w:val="0"/>
         </w:rPr>
-        <w:t>Using a calibrated dynamic network model of heterosexual HIV transmission in South Africa, we estimated that an AI health companion that durably engages AGYW with HIV testing and PrEP could avert a meaningful share of new infections — on the order of 6–10% at 50% reach under central-to-optimistic assumptions, corresponding to roughly 41,000–72,000 infections nationally over a decade. The effect was statistically supported in five of nine scenarios and increased monotonically with reach and with the assumed causal fraction of the observed engagement effect. To our knowledge this is the first transmission-dynamic estimate of the population HIV impact of a conversational AI health tool.</w:t>
+        <w:t>Using a calibrated dynamic network model of heterosexual HIV transmission in South Africa, we estimated that an AI health companion that durably engages AGYW with HIV testing and PrEP could avert a meaningful share of new infections — on the order of 6–10% at 50% reach under central-to-optimistic assumptions, corresponding to roughly 45,000–75,000 infections nationally over a decade. The effect was statistically supported in eight of nine scenarios and increased monotonically with reach and with the assumed causal fraction of the observed engagement effect. To our knowledge this is the first transmission-dynamic estimate of the population HIV impact of a conversational AI health tool.</w:t>
       </w:r>
     </w:p>
     <w:p>
@@ -3167,7 +3185,7 @@
               <w:rPr>
                 <w:sz w:val="18"/>
               </w:rPr>
-              <w:t>24 / 20,000</w:t>
+              <w:t>96 / 20,000</w:t>
             </w:r>
           </w:p>
         </w:tc>

</xml_diff>

<commit_message>
Add implementation-science PrEP demand-vs-persistence sub-study results
Persistence sub-study (R/51, N=20000 x 24, pairing exact): at 50% reach,
demand-only averts 5.8% (validates main r50-central 6.2%); persistence-only
1.0/3.7/5.1% at 20/40/60% discontinuation reduction — nearly matching demand
at strong retention despite ~flat coverage, by concentrating protection on
high-risk eligible women; BOTH is super-additive (11.6% at -40% vs 9.4%
additive; up to 14.5%). Added Methods subsection (3 levers + persistence
scenario-range limitation), Results subsection + Table 3, Discussion
paragraph; rebuilt .docx; exported persistence_table.csv.
</commit_message>
<xml_diff>
--- a/Aimee_AGYW_HIV_manuscript.docx
+++ b/Aimee_AGYW_HIV_manuscript.docx
@@ -507,6 +507,22 @@
           <w:i w:val="0"/>
         </w:rPr>
         <w:t>The Aimee chatbot was represented not mechanistically but as a perturbation of the two behavioural parameters it affects, applied to the subset of AGYW reached, from 2025 onward. Each woman was designated an Aimee user at cohort entry with probability equal to the scenario reach; while she was AGYW (15–24) and from 2025, her HIV-testing rate was multiplied by a testing rate ratio and her PrEP initiation rate by a PrEP rate ratio (with reached AGYW also rendered PrEP-eligible, consistent with their priority-population status). Rate ratios were derived from the Clover hazard ratios scaled by an assumed causal fraction: rate ratio = 1 + (HR − 1) × causal fraction. We evaluated a full factorial grid of reach (10%, 30%, 50% of AGYW) × causal fraction (25% [conservative], 50% [central], 100% [optimistic]), plus a no-chatbot counterfactual baseline.</w:t>
+      </w:r>
+    </w:p>
+    <w:p>
+      <w:pPr>
+        <w:pStyle w:val="Heading2"/>
+      </w:pPr>
+      <w:r>
+        <w:t>Implementation strategies: demand generation versus persistence support</w:t>
+      </w:r>
+    </w:p>
+    <w:p>
+      <w:r>
+        <w:rPr>
+          <w:i w:val="0"/>
+        </w:rPr>
+        <w:t>To inform how a chatbot programme should be designed, a secondary analysis decomposed the PrEP effect into the implementation levers the chatbot could act on, at a fixed 50% reach and central initiation effect (testing held at baseline to isolate the PrEP pathway). We distinguished three strategies: (i) demand generation — the chatbot expands PrEP eligibility among reached AGYW and raises their initiation rate (the mechanism used in the primary analysis); (ii) persistence support — the chatbot recruits no new users but reduces discontinuation among reached AGYW already on PrEP, representing digital adherence/retention support; and (iii) both combined. Because the cohort provides a hazard ratio for PrEP initiation but not for continuation, the persistence effect was not estimated from data but explored as a scenario range — a 20%, 40%, or 60% reduction in the weekly discontinuation rate, corresponding to a median time on PrEP increasing from ~6 months to ~7.4, ~9.8, and ~14.8 months respectively, within the range reported for digital adherence-support interventions (a limitation we return to in the Discussion).</w:t>
       </w:r>
     </w:p>
     <w:p>
@@ -1920,6 +1936,795 @@
       </w:r>
     </w:p>
     <w:p>
+      <w:pPr>
+        <w:pStyle w:val="Heading2"/>
+      </w:pPr>
+      <w:r>
+        <w:t>PrEP delivery strategy: demand generation versus persistence support</w:t>
+      </w:r>
+    </w:p>
+    <w:p>
+      <w:r>
+        <w:rPr>
+          <w:i w:val="0"/>
+        </w:rPr>
+        <w:t>A secondary analysis decomposed the 50%-reach effect into demand generation, persistence support, and their combination (Table 3). Demand generation alone — the primary-analysis mechanism — averted 5.8% of AGYW infections (43,192; 95% CI 25,852–60,531) and raised PrEP coverage from ~3% to ~11%, but coverage plateaued as initiated women continuously discontinued. Persistence support alone, which recruited no new users, averted 1.0% (not significant), 3.7% (p = 0.009), and 5.1% (p &lt; 0.001) of infections at a 20%, 40%, and 60% reduction in discontinuation — approaching the impact of demand generation at the strongest assumption, despite barely changing overall PrEP coverage (≤3.2%). This efficiency arises because persistence support concentrates protection on the clinically-eligible, higher-risk women already on PrEP, extending their protected time rather than diluting coverage across lower-risk new initiators.</w:t>
+      </w:r>
+    </w:p>
+    <w:p>
+      <w:r>
+        <w:rPr>
+          <w:i w:val="0"/>
+        </w:rPr>
+        <w:t>Combining the two strategies was super-additive: at a 40% reduction in discontinuation, demand-plus-persistence averted 11.6% of infections (86,480; 95% CI 73,222–99,738) — exceeding the 9.4% expected if the levers were additive (synergy +2.1 percentage points) — and reached 14.5% at a 60% reduction, with PrEP coverage rising to ~15.5%. Recruiting more women and keeping them on PrEP compounded, because each additional initiator contributed more protected person-time.</w:t>
+      </w:r>
+    </w:p>
+    <w:p>
+      <w:r>
+        <w:rPr>
+          <w:b/>
+          <w:sz w:val="20"/>
+        </w:rPr>
+        <w:t>Table 3. PrEP delivery strategy — demand vs persistence (50% reach, central initiation).</w:t>
+      </w:r>
+    </w:p>
+    <w:tbl>
+      <w:tblPr>
+        <w:tblStyle w:val="LightGrid-Accent1"/>
+        <w:tblW w:type="auto" w:w="0"/>
+        <w:jc w:val="center"/>
+        <w:tblLook w:firstColumn="1" w:firstRow="1" w:lastColumn="0" w:lastRow="0" w:noHBand="0" w:noVBand="1" w:val="04A0"/>
+      </w:tblPr>
+      <w:tblGrid>
+        <w:gridCol w:w="1440"/>
+        <w:gridCol w:w="1440"/>
+        <w:gridCol w:w="1440"/>
+        <w:gridCol w:w="1440"/>
+        <w:gridCol w:w="1440"/>
+        <w:gridCol w:w="1440"/>
+      </w:tblGrid>
+      <w:tr>
+        <w:tc>
+          <w:tcPr>
+            <w:tcW w:type="dxa" w:w="1872"/>
+          </w:tcPr>
+          <w:p>
+            <w:r/>
+            <w:r>
+              <w:rPr>
+                <w:b/>
+                <w:sz w:val="18"/>
+              </w:rPr>
+              <w:t>Strategy</w:t>
+            </w:r>
+          </w:p>
+        </w:tc>
+        <w:tc>
+          <w:tcPr>
+            <w:tcW w:type="dxa" w:w="1440"/>
+          </w:tcPr>
+          <w:p>
+            <w:r/>
+            <w:r>
+              <w:rPr>
+                <w:b/>
+                <w:sz w:val="18"/>
+              </w:rPr>
+              <w:t>Disc. reduction</w:t>
+            </w:r>
+          </w:p>
+        </w:tc>
+        <w:tc>
+          <w:tcPr>
+            <w:tcW w:type="dxa" w:w="2304"/>
+          </w:tcPr>
+          <w:p>
+            <w:r/>
+            <w:r>
+              <w:rPr>
+                <w:b/>
+                <w:sz w:val="18"/>
+              </w:rPr>
+              <w:t>Infections averted (mean)</w:t>
+            </w:r>
+          </w:p>
+        </w:tc>
+        <w:tc>
+          <w:tcPr>
+            <w:tcW w:type="dxa" w:w="2016"/>
+          </w:tcPr>
+          <w:p>
+            <w:r/>
+            <w:r>
+              <w:rPr>
+                <w:b/>
+                <w:sz w:val="18"/>
+              </w:rPr>
+              <w:t>95% CI</w:t>
+            </w:r>
+          </w:p>
+        </w:tc>
+        <w:tc>
+          <w:tcPr>
+            <w:tcW w:type="dxa" w:w="864"/>
+          </w:tcPr>
+          <w:p>
+            <w:r/>
+            <w:r>
+              <w:rPr>
+                <w:b/>
+                <w:sz w:val="18"/>
+              </w:rPr>
+              <w:t>p</w:t>
+            </w:r>
+          </w:p>
+        </w:tc>
+        <w:tc>
+          <w:tcPr>
+            <w:tcW w:type="dxa" w:w="1152"/>
+          </w:tcPr>
+          <w:p>
+            <w:r/>
+            <w:r>
+              <w:rPr>
+                <w:b/>
+                <w:sz w:val="18"/>
+              </w:rPr>
+              <w:t>% averted</w:t>
+            </w:r>
+          </w:p>
+        </w:tc>
+      </w:tr>
+      <w:tr>
+        <w:tc>
+          <w:tcPr>
+            <w:tcW w:type="dxa" w:w="1872"/>
+          </w:tcPr>
+          <w:p>
+            <w:r/>
+            <w:r>
+              <w:rPr>
+                <w:b/>
+                <w:sz w:val="18"/>
+              </w:rPr>
+              <w:t>Demand only</w:t>
+            </w:r>
+          </w:p>
+        </w:tc>
+        <w:tc>
+          <w:tcPr>
+            <w:tcW w:type="dxa" w:w="1440"/>
+          </w:tcPr>
+          <w:p>
+            <w:r/>
+            <w:r>
+              <w:rPr>
+                <w:b/>
+                <w:sz w:val="18"/>
+              </w:rPr>
+              <w:t>—</w:t>
+            </w:r>
+          </w:p>
+        </w:tc>
+        <w:tc>
+          <w:tcPr>
+            <w:tcW w:type="dxa" w:w="2304"/>
+          </w:tcPr>
+          <w:p>
+            <w:r/>
+            <w:r>
+              <w:rPr>
+                <w:b/>
+                <w:sz w:val="18"/>
+              </w:rPr>
+              <w:t>43,192</w:t>
+            </w:r>
+          </w:p>
+        </w:tc>
+        <w:tc>
+          <w:tcPr>
+            <w:tcW w:type="dxa" w:w="2016"/>
+          </w:tcPr>
+          <w:p>
+            <w:r/>
+            <w:r>
+              <w:rPr>
+                <w:b/>
+                <w:sz w:val="18"/>
+              </w:rPr>
+              <w:t>25,852 – 60,531</w:t>
+            </w:r>
+          </w:p>
+        </w:tc>
+        <w:tc>
+          <w:tcPr>
+            <w:tcW w:type="dxa" w:w="864"/>
+          </w:tcPr>
+          <w:p>
+            <w:r/>
+            <w:r>
+              <w:rPr>
+                <w:b/>
+                <w:sz w:val="18"/>
+              </w:rPr>
+              <w:t>&lt;0.001</w:t>
+            </w:r>
+          </w:p>
+        </w:tc>
+        <w:tc>
+          <w:tcPr>
+            <w:tcW w:type="dxa" w:w="1152"/>
+          </w:tcPr>
+          <w:p>
+            <w:r/>
+            <w:r>
+              <w:rPr>
+                <w:b/>
+                <w:sz w:val="18"/>
+              </w:rPr>
+              <w:t>5.8%</w:t>
+            </w:r>
+          </w:p>
+        </w:tc>
+      </w:tr>
+      <w:tr>
+        <w:tc>
+          <w:tcPr>
+            <w:tcW w:type="dxa" w:w="1872"/>
+          </w:tcPr>
+          <w:p>
+            <w:r/>
+            <w:r>
+              <w:rPr>
+                <w:sz w:val="18"/>
+              </w:rPr>
+              <w:t>Persistence only</w:t>
+            </w:r>
+          </w:p>
+        </w:tc>
+        <w:tc>
+          <w:tcPr>
+            <w:tcW w:type="dxa" w:w="1440"/>
+          </w:tcPr>
+          <w:p>
+            <w:r/>
+            <w:r>
+              <w:rPr>
+                <w:sz w:val="18"/>
+              </w:rPr>
+              <w:t>20%</w:t>
+            </w:r>
+          </w:p>
+        </w:tc>
+        <w:tc>
+          <w:tcPr>
+            <w:tcW w:type="dxa" w:w="2304"/>
+          </w:tcPr>
+          <w:p>
+            <w:r/>
+            <w:r>
+              <w:rPr>
+                <w:sz w:val="18"/>
+              </w:rPr>
+              <w:t>7,310</w:t>
+            </w:r>
+          </w:p>
+        </w:tc>
+        <w:tc>
+          <w:tcPr>
+            <w:tcW w:type="dxa" w:w="2016"/>
+          </w:tcPr>
+          <w:p>
+            <w:r/>
+            <w:r>
+              <w:rPr>
+                <w:sz w:val="18"/>
+              </w:rPr>
+              <w:t>−9,864 – 24,483</w:t>
+            </w:r>
+          </w:p>
+        </w:tc>
+        <w:tc>
+          <w:tcPr>
+            <w:tcW w:type="dxa" w:w="864"/>
+          </w:tcPr>
+          <w:p>
+            <w:r/>
+            <w:r>
+              <w:rPr>
+                <w:sz w:val="18"/>
+              </w:rPr>
+              <w:t>0.388</w:t>
+            </w:r>
+          </w:p>
+        </w:tc>
+        <w:tc>
+          <w:tcPr>
+            <w:tcW w:type="dxa" w:w="1152"/>
+          </w:tcPr>
+          <w:p>
+            <w:r/>
+            <w:r>
+              <w:rPr>
+                <w:sz w:val="18"/>
+              </w:rPr>
+              <w:t>1.0%</w:t>
+            </w:r>
+          </w:p>
+        </w:tc>
+      </w:tr>
+      <w:tr>
+        <w:tc>
+          <w:tcPr>
+            <w:tcW w:type="dxa" w:w="1872"/>
+          </w:tcPr>
+          <w:p>
+            <w:r/>
+            <w:r>
+              <w:rPr>
+                <w:b/>
+                <w:sz w:val="18"/>
+              </w:rPr>
+              <w:t>Persistence only</w:t>
+            </w:r>
+          </w:p>
+        </w:tc>
+        <w:tc>
+          <w:tcPr>
+            <w:tcW w:type="dxa" w:w="1440"/>
+          </w:tcPr>
+          <w:p>
+            <w:r/>
+            <w:r>
+              <w:rPr>
+                <w:b/>
+                <w:sz w:val="18"/>
+              </w:rPr>
+              <w:t>40%</w:t>
+            </w:r>
+          </w:p>
+        </w:tc>
+        <w:tc>
+          <w:tcPr>
+            <w:tcW w:type="dxa" w:w="2304"/>
+          </w:tcPr>
+          <w:p>
+            <w:r/>
+            <w:r>
+              <w:rPr>
+                <w:b/>
+                <w:sz w:val="18"/>
+              </w:rPr>
+              <w:t>27,465</w:t>
+            </w:r>
+          </w:p>
+        </w:tc>
+        <w:tc>
+          <w:tcPr>
+            <w:tcW w:type="dxa" w:w="2016"/>
+          </w:tcPr>
+          <w:p>
+            <w:r/>
+            <w:r>
+              <w:rPr>
+                <w:b/>
+                <w:sz w:val="18"/>
+              </w:rPr>
+              <w:t>7,623 – 47,306</w:t>
+            </w:r>
+          </w:p>
+        </w:tc>
+        <w:tc>
+          <w:tcPr>
+            <w:tcW w:type="dxa" w:w="864"/>
+          </w:tcPr>
+          <w:p>
+            <w:r/>
+            <w:r>
+              <w:rPr>
+                <w:b/>
+                <w:sz w:val="18"/>
+              </w:rPr>
+              <w:t>0.009</w:t>
+            </w:r>
+          </w:p>
+        </w:tc>
+        <w:tc>
+          <w:tcPr>
+            <w:tcW w:type="dxa" w:w="1152"/>
+          </w:tcPr>
+          <w:p>
+            <w:r/>
+            <w:r>
+              <w:rPr>
+                <w:b/>
+                <w:sz w:val="18"/>
+              </w:rPr>
+              <w:t>3.7%</w:t>
+            </w:r>
+          </w:p>
+        </w:tc>
+      </w:tr>
+      <w:tr>
+        <w:tc>
+          <w:tcPr>
+            <w:tcW w:type="dxa" w:w="1872"/>
+          </w:tcPr>
+          <w:p>
+            <w:r/>
+            <w:r>
+              <w:rPr>
+                <w:b/>
+                <w:sz w:val="18"/>
+              </w:rPr>
+              <w:t>Persistence only</w:t>
+            </w:r>
+          </w:p>
+        </w:tc>
+        <w:tc>
+          <w:tcPr>
+            <w:tcW w:type="dxa" w:w="1440"/>
+          </w:tcPr>
+          <w:p>
+            <w:r/>
+            <w:r>
+              <w:rPr>
+                <w:b/>
+                <w:sz w:val="18"/>
+              </w:rPr>
+              <w:t>60%</w:t>
+            </w:r>
+          </w:p>
+        </w:tc>
+        <w:tc>
+          <w:tcPr>
+            <w:tcW w:type="dxa" w:w="2304"/>
+          </w:tcPr>
+          <w:p>
+            <w:r/>
+            <w:r>
+              <w:rPr>
+                <w:b/>
+                <w:sz w:val="18"/>
+              </w:rPr>
+              <w:t>38,010</w:t>
+            </w:r>
+          </w:p>
+        </w:tc>
+        <w:tc>
+          <w:tcPr>
+            <w:tcW w:type="dxa" w:w="2016"/>
+          </w:tcPr>
+          <w:p>
+            <w:r/>
+            <w:r>
+              <w:rPr>
+                <w:b/>
+                <w:sz w:val="18"/>
+              </w:rPr>
+              <w:t>22,275 – 53,746</w:t>
+            </w:r>
+          </w:p>
+        </w:tc>
+        <w:tc>
+          <w:tcPr>
+            <w:tcW w:type="dxa" w:w="864"/>
+          </w:tcPr>
+          <w:p>
+            <w:r/>
+            <w:r>
+              <w:rPr>
+                <w:b/>
+                <w:sz w:val="18"/>
+              </w:rPr>
+              <w:t>&lt;0.001</w:t>
+            </w:r>
+          </w:p>
+        </w:tc>
+        <w:tc>
+          <w:tcPr>
+            <w:tcW w:type="dxa" w:w="1152"/>
+          </w:tcPr>
+          <w:p>
+            <w:r/>
+            <w:r>
+              <w:rPr>
+                <w:b/>
+                <w:sz w:val="18"/>
+              </w:rPr>
+              <w:t>5.1%</w:t>
+            </w:r>
+          </w:p>
+        </w:tc>
+      </w:tr>
+      <w:tr>
+        <w:tc>
+          <w:tcPr>
+            <w:tcW w:type="dxa" w:w="1872"/>
+          </w:tcPr>
+          <w:p>
+            <w:r/>
+            <w:r>
+              <w:rPr>
+                <w:b/>
+                <w:sz w:val="18"/>
+              </w:rPr>
+              <w:t>Both</w:t>
+            </w:r>
+          </w:p>
+        </w:tc>
+        <w:tc>
+          <w:tcPr>
+            <w:tcW w:type="dxa" w:w="1440"/>
+          </w:tcPr>
+          <w:p>
+            <w:r/>
+            <w:r>
+              <w:rPr>
+                <w:b/>
+                <w:sz w:val="18"/>
+              </w:rPr>
+              <w:t>20%</w:t>
+            </w:r>
+          </w:p>
+        </w:tc>
+        <w:tc>
+          <w:tcPr>
+            <w:tcW w:type="dxa" w:w="2304"/>
+          </w:tcPr>
+          <w:p>
+            <w:r/>
+            <w:r>
+              <w:rPr>
+                <w:b/>
+                <w:sz w:val="18"/>
+              </w:rPr>
+              <w:t>77,035</w:t>
+            </w:r>
+          </w:p>
+        </w:tc>
+        <w:tc>
+          <w:tcPr>
+            <w:tcW w:type="dxa" w:w="2016"/>
+          </w:tcPr>
+          <w:p>
+            <w:r/>
+            <w:r>
+              <w:rPr>
+                <w:b/>
+                <w:sz w:val="18"/>
+              </w:rPr>
+              <w:t>63,437 – 90,633</w:t>
+            </w:r>
+          </w:p>
+        </w:tc>
+        <w:tc>
+          <w:tcPr>
+            <w:tcW w:type="dxa" w:w="864"/>
+          </w:tcPr>
+          <w:p>
+            <w:r/>
+            <w:r>
+              <w:rPr>
+                <w:b/>
+                <w:sz w:val="18"/>
+              </w:rPr>
+              <w:t>&lt;0.001</w:t>
+            </w:r>
+          </w:p>
+        </w:tc>
+        <w:tc>
+          <w:tcPr>
+            <w:tcW w:type="dxa" w:w="1152"/>
+          </w:tcPr>
+          <w:p>
+            <w:r/>
+            <w:r>
+              <w:rPr>
+                <w:b/>
+                <w:sz w:val="18"/>
+              </w:rPr>
+              <w:t>10.3%</w:t>
+            </w:r>
+          </w:p>
+        </w:tc>
+      </w:tr>
+      <w:tr>
+        <w:tc>
+          <w:tcPr>
+            <w:tcW w:type="dxa" w:w="1872"/>
+          </w:tcPr>
+          <w:p>
+            <w:r/>
+            <w:r>
+              <w:rPr>
+                <w:b/>
+                <w:sz w:val="18"/>
+              </w:rPr>
+              <w:t>Both</w:t>
+            </w:r>
+          </w:p>
+        </w:tc>
+        <w:tc>
+          <w:tcPr>
+            <w:tcW w:type="dxa" w:w="1440"/>
+          </w:tcPr>
+          <w:p>
+            <w:r/>
+            <w:r>
+              <w:rPr>
+                <w:b/>
+                <w:sz w:val="18"/>
+              </w:rPr>
+              <w:t>40%</w:t>
+            </w:r>
+          </w:p>
+        </w:tc>
+        <w:tc>
+          <w:tcPr>
+            <w:tcW w:type="dxa" w:w="2304"/>
+          </w:tcPr>
+          <w:p>
+            <w:r/>
+            <w:r>
+              <w:rPr>
+                <w:b/>
+                <w:sz w:val="18"/>
+              </w:rPr>
+              <w:t>86,480</w:t>
+            </w:r>
+          </w:p>
+        </w:tc>
+        <w:tc>
+          <w:tcPr>
+            <w:tcW w:type="dxa" w:w="2016"/>
+          </w:tcPr>
+          <w:p>
+            <w:r/>
+            <w:r>
+              <w:rPr>
+                <w:b/>
+                <w:sz w:val="18"/>
+              </w:rPr>
+              <w:t>73,222 – 99,738</w:t>
+            </w:r>
+          </w:p>
+        </w:tc>
+        <w:tc>
+          <w:tcPr>
+            <w:tcW w:type="dxa" w:w="864"/>
+          </w:tcPr>
+          <w:p>
+            <w:r/>
+            <w:r>
+              <w:rPr>
+                <w:b/>
+                <w:sz w:val="18"/>
+              </w:rPr>
+              <w:t>&lt;0.001</w:t>
+            </w:r>
+          </w:p>
+        </w:tc>
+        <w:tc>
+          <w:tcPr>
+            <w:tcW w:type="dxa" w:w="1152"/>
+          </w:tcPr>
+          <w:p>
+            <w:r/>
+            <w:r>
+              <w:rPr>
+                <w:b/>
+                <w:sz w:val="18"/>
+              </w:rPr>
+              <w:t>11.6%</w:t>
+            </w:r>
+          </w:p>
+        </w:tc>
+      </w:tr>
+      <w:tr>
+        <w:tc>
+          <w:tcPr>
+            <w:tcW w:type="dxa" w:w="1872"/>
+          </w:tcPr>
+          <w:p>
+            <w:r/>
+            <w:r>
+              <w:rPr>
+                <w:b/>
+                <w:sz w:val="18"/>
+              </w:rPr>
+              <w:t>Both</w:t>
+            </w:r>
+          </w:p>
+        </w:tc>
+        <w:tc>
+          <w:tcPr>
+            <w:tcW w:type="dxa" w:w="1440"/>
+          </w:tcPr>
+          <w:p>
+            <w:r/>
+            <w:r>
+              <w:rPr>
+                <w:b/>
+                <w:sz w:val="18"/>
+              </w:rPr>
+              <w:t>60%</w:t>
+            </w:r>
+          </w:p>
+        </w:tc>
+        <w:tc>
+          <w:tcPr>
+            <w:tcW w:type="dxa" w:w="2304"/>
+          </w:tcPr>
+          <w:p>
+            <w:r/>
+            <w:r>
+              <w:rPr>
+                <w:b/>
+                <w:sz w:val="18"/>
+              </w:rPr>
+              <w:t>108,253</w:t>
+            </w:r>
+          </w:p>
+        </w:tc>
+        <w:tc>
+          <w:tcPr>
+            <w:tcW w:type="dxa" w:w="2016"/>
+          </w:tcPr>
+          <w:p>
+            <w:r/>
+            <w:r>
+              <w:rPr>
+                <w:b/>
+                <w:sz w:val="18"/>
+              </w:rPr>
+              <w:t>90,444 – 126,063</w:t>
+            </w:r>
+          </w:p>
+        </w:tc>
+        <w:tc>
+          <w:tcPr>
+            <w:tcW w:type="dxa" w:w="864"/>
+          </w:tcPr>
+          <w:p>
+            <w:r/>
+            <w:r>
+              <w:rPr>
+                <w:b/>
+                <w:sz w:val="18"/>
+              </w:rPr>
+              <w:t>&lt;0.001</w:t>
+            </w:r>
+          </w:p>
+        </w:tc>
+        <w:tc>
+          <w:tcPr>
+            <w:tcW w:type="dxa" w:w="1152"/>
+          </w:tcPr>
+          <w:p>
+            <w:r/>
+            <w:r>
+              <w:rPr>
+                <w:b/>
+                <w:sz w:val="18"/>
+              </w:rPr>
+              <w:t>14.5%</w:t>
+            </w:r>
+          </w:p>
+        </w:tc>
+      </w:tr>
+    </w:tbl>
+    <w:p/>
+    <w:p>
+      <w:r>
+        <w:rPr>
+          <w:i/>
+          <w:sz w:val="18"/>
+        </w:rPr>
+        <w:t>Baseline ~747,703 national AGYW infections. Demand only = expand eligibility + boost initiation; Persistence only = reduce discontinuation among reached AGYW on PrEP (no new initiation); Both = combined. Testing held at baseline. Bold rows: 95% CI excludes zero. 96 paired replicates, population 20,000. The persistence effect is a literature-informed scenario range, not a cohort estimate.</w:t>
+      </w:r>
+    </w:p>
+    <w:p>
       <w:r>
         <w:br w:type="page"/>
       </w:r>
@@ -1946,6 +2751,14 @@
           <w:i w:val="0"/>
         </w:rPr>
         <w:t>The projected benefit operated almost entirely through PrEP. Because the chatbot raises PrEP initiation among a priority population that partners with higher-prevalence older men, even modest absolute coverage gains translate into averted acquisitions. Critically, the magnitude of the effect was bounded by PrEP continuation: under realistic oral-PrEP discontinuation, chatbot-driven coverage plateaued at roughly half the level it reached under an optimistic long-retention assumption, because the intervention must continually re-initiate women who fall off PrEP. This points to a clear programmatic implication — tools that sustain PrEP persistence, or that channel young women toward longer-acting formulations such as injectable cabotegravir or lenacapavir, would be expected to yield substantially larger and more durable impact than demand generation alone.</w:t>
+      </w:r>
+    </w:p>
+    <w:p>
+      <w:r>
+        <w:rPr>
+          <w:i w:val="0"/>
+        </w:rPr>
+        <w:t>Our implementation-strategy analysis makes this concrete and carries a direct programmatic message. The conventional framing of a digital health tool — as a demand-generation channel that drives people to initiate PrEP — captured only part of its potential value. Retention support alone, keeping already-eligible higher-risk young women on PrEP, approached the impact of demand generation (5.1% vs 5.8% of infections averted at the strongest assumption) while barely changing measured coverage, because it concentrates protection on the women at greatest risk rather than diluting it across new lower-risk initiators. Combining demand with retention was super-additive, averting up to 14.5% of infections — more than the sum of the two levers applied separately. Because oral-PrEP continuation among South African AGYW is poor, a chatbot that sustains use — through reminders, side-effect counselling, refill navigation, or steering toward long-acting formulations — may convert the same engagement into more averted infections than initiation messaging alone, and programmes that pair demand generation with retention support should expect more than the sum of their parts. We caution that the persistence effect was not measured in the cohort, which yields an initiation hazard ratio, and was explored as a literature-informed scenario range; quantifying the chatbot's true effect on PrEP continuation is a priority for future data collection and randomised evaluation.</w:t>
       </w:r>
     </w:p>
     <w:p>

</xml_diff>

<commit_message>
Embed figures into manuscript .docx
Add a figure() image helper and a Figures section embedding 5 figures with
captions: (1) calibration fit, (2) infections averted by reach x causal,
(3) dose-response + efficiency, (4) mechanism (incidence + PrEP coverage),
(5) demand-vs-persistence strategy. Add in-text Figure 1-5 callouts in
Results.
</commit_message>
<xml_diff>
--- a/Aimee_AGYW_HIV_manuscript.docx
+++ b/Aimee_AGYW_HIV_manuscript.docx
@@ -583,7 +583,7 @@
         <w:rPr>
           <w:i w:val="0"/>
         </w:rPr>
-        <w:t>The calibrated model reproduced the South African HIV epidemic trajectory from 1990 to 2022. Following HIV introduction in 1990, simulated prevalence among women aged 15–24 rose through the 1990s, peaked at approximately 15–16% in the early-to-mid 2000s, and declined to ~8% by 2022 as ART scaled up — closely tracking the Thembisa estimates. Adult (15–49) prevalence followed the same rise–peak–decline pattern, peaking at ~19–21%. The best-fitting per-act transmission probability (0.0035) produced a trajectory root-mean-square error of 0.031 against the joint prevalence and incidence targets. The model reproduced the age-disparate structure underlying AGYW risk: HIV prevalence in the older male partner pool (men 25–44) rose steeply with age (~7% to ~22%), against which AGYW acquired infection.</w:t>
+        <w:t>The calibrated model reproduced the South African HIV epidemic trajectory from 1990 to 2022. Following HIV introduction in 1990, simulated prevalence among women aged 15–24 rose through the 1990s, peaked at approximately 15–16% in the early-to-mid 2000s, and declined to ~8% by 2022 as ART scaled up — closely tracking the Thembisa estimates. Adult (15–49) prevalence followed the same rise–peak–decline pattern, peaking at ~19–21%. The best-fitting per-act transmission probability (0.0035) produced a trajectory root-mean-square error of 0.031 against the joint prevalence and incidence targets. The model reproduced the age-disparate structure underlying AGYW risk: HIV prevalence in the older male partner pool (men 25–44) rose steeply with age (~7% to ~22%), against which AGYW acquired infection (Figure 1).</w:t>
       </w:r>
     </w:p>
     <w:p>
@@ -933,7 +933,7 @@
         <w:rPr>
           <w:i w:val="0"/>
         </w:rPr>
-        <w:t>In the no-chatbot counterfactual, the model projected approximately 733,000 new HIV infections among AGYW nationally over 2025–2035 (median; interquartile range 696,000–762,000). This baseline incorporates realistic oral-PrEP discontinuation (≈6-month median retention), so baseline PrEP coverage remained low (~3%, consistent with South African estimates) with rapid turnover. Introducing the chatbot in 2025 reduced this burden, with impact increasing monotonically with both reach and the assumed causal fraction of the observed engagement effect (Table 2).</w:t>
+        <w:t>In the no-chatbot counterfactual, the model projected approximately 733,000 new HIV infections among AGYW nationally over 2025–2035 (median; interquartile range 696,000–762,000). This baseline incorporates realistic oral-PrEP discontinuation (≈6-month median retention), so baseline PrEP coverage remained low (~3%, consistent with South African estimates) with rapid turnover. Introducing the chatbot in 2025 reduced this burden, with impact increasing monotonically with both reach and the assumed causal fraction of the observed engagement effect (Figure 2; Table 2).</w:t>
       </w:r>
     </w:p>
     <w:p>
@@ -967,7 +967,7 @@
         <w:rPr>
           <w:i w:val="0"/>
         </w:rPr>
-        <w:t xml:space="preserve"> under the optimistic assumption; even the conservative assumption averted a significant 4.9% (35,670; 27,050–44,290; p &lt; 0.001). At 30% reach the estimates were 3.3% / 4.3% / 6.3% (conservative / central / optimistic; all p &lt; 0.001), and at 10% reach 1.2–2.5%. Effects were statistically supported (95% CI excluding zero) in eight of the nine intervention scenarios — every scenario except the 10%-reach central scenario (0.9%; p = 0.11). With 96 replicates these intervals were tight (±9,500 at 50% reach, optimistic). Efficiency improved with increasing reach under the optimistic assumption, reflecting the dose–response of the intervention.</w:t>
+        <w:t xml:space="preserve"> under the optimistic assumption; even the conservative assumption averted a significant 4.9% (35,670; 27,050–44,290; p &lt; 0.001). At 30% reach the estimates were 3.3% / 4.3% / 6.3% (conservative / central / optimistic; all p &lt; 0.001), and at 10% reach 1.2–2.5%. Effects were statistically supported (95% CI excluding zero) in eight of the nine intervention scenarios — every scenario except the 10%-reach central scenario (0.9%; p = 0.11). With 96 replicates these intervals were tight (±9,500 at 50% reach, optimistic). Efficiency improved with increasing reach under the optimistic assumption, reflecting the dose–response of the intervention (Figure 3).</w:t>
       </w:r>
     </w:p>
     <w:p>
@@ -1932,7 +1932,7 @@
         <w:rPr>
           <w:i w:val="0"/>
         </w:rPr>
-        <w:t>The projected impact was driven by increased PrEP uptake among reached AGYW. In the counterfactual, PrEP coverage among AGYW remained near the baseline level (~3%), with rapid turnover reflecting realistic oral-PrEP discontinuation. Following chatbot introduction in 2025, PrEP coverage among AGYW rose to approximately 8% at 30% reach, ~11% at 50% reach (central), and ~14% at 50% reach (optimistic) by 2034 — roughly half the coverage attainable under an optimistic (long-retention) discontinuation assumption, because realistic discontinuation continually erodes coverage and the chatbot must keep re-initiating to sustain it. Corresponding increases in HIV testing and diagnosis accompanied the PrEP gains, and the incidence trajectories diverged from baseline after 2025, with the largest reductions under the highest reach and effect-size assumptions.</w:t>
+        <w:t>The projected impact was driven by increased PrEP uptake among reached AGYW. In the counterfactual, PrEP coverage among AGYW remained near the baseline level (~3%), with rapid turnover reflecting realistic oral-PrEP discontinuation. Following chatbot introduction in 2025, PrEP coverage among AGYW rose to approximately 8% at 30% reach, ~11% at 50% reach (central), and ~14% at 50% reach (optimistic) by 2034 — roughly half the coverage attainable under an optimistic (long-retention) discontinuation assumption, because realistic discontinuation continually erodes coverage and the chatbot must keep re-initiating to sustain it. Corresponding increases in HIV testing and diagnosis accompanied the PrEP gains, and the incidence trajectories diverged from baseline after 2025, with the largest reductions under the highest reach and effect-size assumptions (Figure 4).</w:t>
       </w:r>
     </w:p>
     <w:p>
@@ -1948,7 +1948,7 @@
         <w:rPr>
           <w:i w:val="0"/>
         </w:rPr>
-        <w:t>A secondary analysis decomposed the 50%-reach effect into demand generation, persistence support, and their combination (Table 3). Demand generation alone — the primary-analysis mechanism — averted 5.8% of AGYW infections (43,192; 95% CI 25,852–60,531) and raised PrEP coverage from ~3% to ~11%, but coverage plateaued as initiated women continuously discontinued. Persistence support alone, which recruited no new users, averted 1.0% (not significant), 3.7% (p = 0.009), and 5.1% (p &lt; 0.001) of infections at a 20%, 40%, and 60% reduction in discontinuation — approaching the impact of demand generation at the strongest assumption, despite barely changing overall PrEP coverage (≤3.2%). This efficiency arises because persistence support concentrates protection on the clinically-eligible, higher-risk women already on PrEP, extending their protected time rather than diluting coverage across lower-risk new initiators.</w:t>
+        <w:t>A secondary analysis decomposed the 50%-reach effect into demand generation, persistence support, and their combination (Figure 5; Table 3). Demand generation alone — the primary-analysis mechanism — averted 5.8% of AGYW infections (43,192; 95% CI 25,852–60,531) and raised PrEP coverage from ~3% to ~11%, but coverage plateaued as initiated women continuously discontinued. Persistence support alone, which recruited no new users, averted 1.0% (not significant), 3.7% (p = 0.009), and 5.1% (p &lt; 0.001) of infections at a 20%, 40%, and 60% reduction in discontinuation — approaching the impact of demand generation at the strongest assumption, despite barely changing overall PrEP coverage (≤3.2%). This efficiency arises because persistence support concentrates protection on the clinically-eligible, higher-risk women already on PrEP, extending their protected time rather than diluting coverage across lower-risk new initiators.</w:t>
       </w:r>
     </w:p>
     <w:p>
@@ -2960,6 +2960,309 @@
         <w:t>14. [ART treatment-as-prevention] HPTN 052 or equivalent for the near-zero infectiousness of virally suppressed individuals. [Complete citation.]</w:t>
       </w:r>
     </w:p>
+    <w:p>
+      <w:r>
+        <w:br w:type="page"/>
+      </w:r>
+    </w:p>
+    <w:p>
+      <w:pPr>
+        <w:pStyle w:val="Heading1"/>
+      </w:pPr>
+      <w:r>
+        <w:t>Figures</w:t>
+      </w:r>
+    </w:p>
+    <w:p>
+      <w:pPr>
+        <w:jc w:val="center"/>
+      </w:pPr>
+      <w:r>
+        <w:drawing>
+          <wp:inline xmlns:a="http://schemas.openxmlformats.org/drawingml/2006/main" xmlns:pic="http://schemas.openxmlformats.org/drawingml/2006/picture">
+            <wp:extent cx="5943600" cy="1920240"/>
+            <wp:docPr id="1" name="Picture 1"/>
+            <wp:cNvGraphicFramePr>
+              <a:graphicFrameLocks noChangeAspect="1"/>
+            </wp:cNvGraphicFramePr>
+            <a:graphic>
+              <a:graphicData uri="http://schemas.openxmlformats.org/drawingml/2006/picture">
+                <pic:pic>
+                  <pic:nvPicPr>
+                    <pic:cNvPr id="0" name="calib_ci.png"/>
+                    <pic:cNvPicPr/>
+                  </pic:nvPicPr>
+                  <pic:blipFill>
+                    <a:blip r:embed="rId9"/>
+                    <a:stretch>
+                      <a:fillRect/>
+                    </a:stretch>
+                  </pic:blipFill>
+                  <pic:spPr>
+                    <a:xfrm>
+                      <a:off x="0" y="0"/>
+                      <a:ext cx="5943600" cy="1920240"/>
+                    </a:xfrm>
+                    <a:prstGeom prst="rect"/>
+                  </pic:spPr>
+                </pic:pic>
+              </a:graphicData>
+            </a:graphic>
+          </wp:inline>
+        </w:drawing>
+      </w:r>
+    </w:p>
+    <w:p>
+      <w:pPr>
+        <w:jc w:val="left"/>
+      </w:pPr>
+      <w:r>
+        <w:rPr>
+          <w:b/>
+          <w:sz w:val="18"/>
+        </w:rPr>
+        <w:t xml:space="preserve">Figure 1. </w:t>
+      </w:r>
+      <w:r>
+        <w:rPr>
+          <w:sz w:val="18"/>
+        </w:rPr>
+        <w:t>Model calibration to the South African HIV epidemic, 1990–2022. Simulated HIV prevalence among women 15–24 and adults 15–49, and HIV incidence among women 15–24 (median and 95% simulation interval across replicates), against Thembisa v5.0 targets. The calibrated model (per-act transmission probability 0.0035) reproduced the rise, peak, and ART-era decline of the epidemic (trajectory RMSE 0.031).</w:t>
+      </w:r>
+    </w:p>
+    <w:p/>
+    <w:p>
+      <w:pPr>
+        <w:jc w:val="center"/>
+      </w:pPr>
+      <w:r>
+        <w:drawing>
+          <wp:inline xmlns:a="http://schemas.openxmlformats.org/drawingml/2006/main" xmlns:pic="http://schemas.openxmlformats.org/drawingml/2006/picture">
+            <wp:extent cx="5943600" cy="3302000"/>
+            <wp:docPr id="2" name="Picture 2"/>
+            <wp:cNvGraphicFramePr>
+              <a:graphicFrameLocks noChangeAspect="1"/>
+            </wp:cNvGraphicFramePr>
+            <a:graphic>
+              <a:graphicData uri="http://schemas.openxmlformats.org/drawingml/2006/picture">
+                <pic:pic>
+                  <pic:nvPicPr>
+                    <pic:cNvPr id="0" name="intervention.png"/>
+                    <pic:cNvPicPr/>
+                  </pic:nvPicPr>
+                  <pic:blipFill>
+                    <a:blip r:embed="rId10"/>
+                    <a:stretch>
+                      <a:fillRect/>
+                    </a:stretch>
+                  </pic:blipFill>
+                  <pic:spPr>
+                    <a:xfrm>
+                      <a:off x="0" y="0"/>
+                      <a:ext cx="5943600" cy="3302000"/>
+                    </a:xfrm>
+                    <a:prstGeom prst="rect"/>
+                  </pic:spPr>
+                </pic:pic>
+              </a:graphicData>
+            </a:graphic>
+          </wp:inline>
+        </w:drawing>
+      </w:r>
+    </w:p>
+    <w:p>
+      <w:pPr>
+        <w:jc w:val="left"/>
+      </w:pPr>
+      <w:r>
+        <w:rPr>
+          <w:b/>
+          <w:sz w:val="18"/>
+        </w:rPr>
+        <w:t xml:space="preserve">Figure 2. </w:t>
+      </w:r>
+      <w:r>
+        <w:rPr>
+          <w:sz w:val="18"/>
+        </w:rPr>
+        <w:t>AGYW HIV infections averted by the Aimee chatbot, 2025–2035, by reach and causal fraction. Bars are mean infections averted over 96 paired (common-random-number) replicates; whiskers are 95% confidence intervals from a paired t test. The SA-realistic baseline projected ~733,000 AGYW infections over the decade.</w:t>
+      </w:r>
+    </w:p>
+    <w:p/>
+    <w:p>
+      <w:pPr>
+        <w:jc w:val="center"/>
+      </w:pPr>
+      <w:r>
+        <w:drawing>
+          <wp:inline xmlns:a="http://schemas.openxmlformats.org/drawingml/2006/main" xmlns:pic="http://schemas.openxmlformats.org/drawingml/2006/picture">
+            <wp:extent cx="5943600" cy="1901952"/>
+            <wp:docPr id="3" name="Picture 3"/>
+            <wp:cNvGraphicFramePr>
+              <a:graphicFrameLocks noChangeAspect="1"/>
+            </wp:cNvGraphicFramePr>
+            <a:graphic>
+              <a:graphicData uri="http://schemas.openxmlformats.org/drawingml/2006/picture">
+                <pic:pic>
+                  <pic:nvPicPr>
+                    <pic:cNvPr id="0" name="intervention_views.png"/>
+                    <pic:cNvPicPr/>
+                  </pic:nvPicPr>
+                  <pic:blipFill>
+                    <a:blip r:embed="rId11"/>
+                    <a:stretch>
+                      <a:fillRect/>
+                    </a:stretch>
+                  </pic:blipFill>
+                  <pic:spPr>
+                    <a:xfrm>
+                      <a:off x="0" y="0"/>
+                      <a:ext cx="5943600" cy="1901952"/>
+                    </a:xfrm>
+                    <a:prstGeom prst="rect"/>
+                  </pic:spPr>
+                </pic:pic>
+              </a:graphicData>
+            </a:graphic>
+          </wp:inline>
+        </w:drawing>
+      </w:r>
+    </w:p>
+    <w:p>
+      <w:pPr>
+        <w:jc w:val="left"/>
+      </w:pPr>
+      <w:r>
+        <w:rPr>
+          <w:b/>
+          <w:sz w:val="18"/>
+        </w:rPr>
+        <w:t xml:space="preserve">Figure 3. </w:t>
+      </w:r>
+      <w:r>
+        <w:rPr>
+          <w:sz w:val="18"/>
+        </w:rPr>
+        <w:t>Dose–response and efficiency. (A) Percentage of AGYW infections averted across the reach × causal-fraction grid. (B) Dose–response: percentage averted rises with reach (bars, 95% CI). (C) Efficiency (AGYW reached per infection averted; lower is more efficient); triangular markers denote scenarios whose upper CI extends off-scale because the effect is near zero and efficiency is undefined.</w:t>
+      </w:r>
+    </w:p>
+    <w:p/>
+    <w:p>
+      <w:pPr>
+        <w:jc w:val="center"/>
+      </w:pPr>
+      <w:r>
+        <w:drawing>
+          <wp:inline xmlns:a="http://schemas.openxmlformats.org/drawingml/2006/main" xmlns:pic="http://schemas.openxmlformats.org/drawingml/2006/picture">
+            <wp:extent cx="5943600" cy="2122714"/>
+            <wp:docPr id="4" name="Picture 4"/>
+            <wp:cNvGraphicFramePr>
+              <a:graphicFrameLocks noChangeAspect="1"/>
+            </wp:cNvGraphicFramePr>
+            <a:graphic>
+              <a:graphicData uri="http://schemas.openxmlformats.org/drawingml/2006/picture">
+                <pic:pic>
+                  <pic:nvPicPr>
+                    <pic:cNvPr id="0" name="trajectories_combined.png"/>
+                    <pic:cNvPicPr/>
+                  </pic:nvPicPr>
+                  <pic:blipFill>
+                    <a:blip r:embed="rId12"/>
+                    <a:stretch>
+                      <a:fillRect/>
+                    </a:stretch>
+                  </pic:blipFill>
+                  <pic:spPr>
+                    <a:xfrm>
+                      <a:off x="0" y="0"/>
+                      <a:ext cx="5943600" cy="2122714"/>
+                    </a:xfrm>
+                    <a:prstGeom prst="rect"/>
+                  </pic:spPr>
+                </pic:pic>
+              </a:graphicData>
+            </a:graphic>
+          </wp:inline>
+        </w:drawing>
+      </w:r>
+    </w:p>
+    <w:p>
+      <w:pPr>
+        <w:jc w:val="left"/>
+      </w:pPr>
+      <w:r>
+        <w:rPr>
+          <w:b/>
+          <w:sz w:val="18"/>
+        </w:rPr>
+        <w:t xml:space="preserve">Figure 4. </w:t>
+      </w:r>
+      <w:r>
+        <w:rPr>
+          <w:sz w:val="18"/>
+        </w:rPr>
+        <w:t>Mechanism of impact. (A) AGYW HIV incidence trajectories — baseline versus chatbot scenarios — diverging after the 2025 introduction. (B) AGYW PrEP coverage, which rises from ~3% to roughly 8–14% depending on reach and causal fraction. Lines are medians; shaded bands are 95% simulation intervals.</w:t>
+      </w:r>
+    </w:p>
+    <w:p/>
+    <w:p>
+      <w:pPr>
+        <w:jc w:val="center"/>
+      </w:pPr>
+      <w:r>
+        <w:drawing>
+          <wp:inline xmlns:a="http://schemas.openxmlformats.org/drawingml/2006/main" xmlns:pic="http://schemas.openxmlformats.org/drawingml/2006/picture">
+            <wp:extent cx="5943600" cy="1981200"/>
+            <wp:docPr id="5" name="Picture 5"/>
+            <wp:cNvGraphicFramePr>
+              <a:graphicFrameLocks noChangeAspect="1"/>
+            </wp:cNvGraphicFramePr>
+            <a:graphic>
+              <a:graphicData uri="http://schemas.openxmlformats.org/drawingml/2006/picture">
+                <pic:pic>
+                  <pic:nvPicPr>
+                    <pic:cNvPr id="0" name="persistence_combined.png"/>
+                    <pic:cNvPicPr/>
+                  </pic:nvPicPr>
+                  <pic:blipFill>
+                    <a:blip r:embed="rId13"/>
+                    <a:stretch>
+                      <a:fillRect/>
+                    </a:stretch>
+                  </pic:blipFill>
+                  <pic:spPr>
+                    <a:xfrm>
+                      <a:off x="0" y="0"/>
+                      <a:ext cx="5943600" cy="1981200"/>
+                    </a:xfrm>
+                    <a:prstGeom prst="rect"/>
+                  </pic:spPr>
+                </pic:pic>
+              </a:graphicData>
+            </a:graphic>
+          </wp:inline>
+        </w:drawing>
+      </w:r>
+    </w:p>
+    <w:p>
+      <w:pPr>
+        <w:jc w:val="left"/>
+      </w:pPr>
+      <w:r>
+        <w:rPr>
+          <w:b/>
+          <w:sz w:val="18"/>
+        </w:rPr>
+        <w:t xml:space="preserve">Figure 5. </w:t>
+      </w:r>
+      <w:r>
+        <w:rPr>
+          <w:sz w:val="18"/>
+        </w:rPr>
+        <w:t>PrEP delivery strategy — demand generation versus persistence support (50% reach, central initiation). (A) AGYW infections averted by strategy: demand generation, persistence support (20/40/60% reduction in discontinuation), and both combined (mean, 95% t-CI). (B) AGYW PrEP coverage by strategy: demand generation raises coverage to ~11% but it plateaus; persistence support barely changes coverage yet averts comparable infections by retaining higher-risk women already on PrEP; the combined strategy is highest (~15.5%).</w:t>
+      </w:r>
+    </w:p>
+    <w:p/>
     <w:p>
       <w:r>
         <w:br w:type="page"/>

</xml_diff>

<commit_message>
Make Methods fully detailed and reproducible (demography + cascade rates)
Expand Methods with explicit numeric rates previously only in the supplement:
- Demography paragraph: weekly step; Poisson entry at 0.0010/wk (~5%/yr, age 15,
  1:1 sex); background mortality 0.0005/wk (~2.6%/yr); AIDS departure 1/104/wk
  (~2yr, x10 on ART); deterministic aging-out at 50; net modest growth.
- Natural history: stage durations (acute 1/12, chronic 1/520), ART progression/
  survival multipliers, stage infectiousness (5x/2x/0.30/0.01).
- Cascade: testing 0.01/wk (~41%/yr), AIDS dx 0.05, linkage 0.50, re-init 0.10,
  suppression 0.30, ART disc 0.01, ramp 2004-2014.
- PrEP: eligibility rule, initiation 0.005/wk, discontinuation 0.027/wk (~6-mo).
Mirrored in build_manuscript.py (.docx) and added an implementation note +
extra rows to the supplement demography section.
</commit_message>
<xml_diff>
--- a/Aimee_AGYW_HIV_manuscript.docx
+++ b/Aimee_AGYW_HIV_manuscript.docx
@@ -261,7 +261,15 @@
         <w:rPr>
           <w:i w:val="0"/>
         </w:rPr>
-        <w:t>The model simulated a closed sexually-active population aged 15–50 years. Partnerships were represented as two concurrent dynamic networks — main (longer-duration, higher per-act frequency) and casual (shorter-duration) — each estimated as a separate temporal exponential-family random graph model (TERGM) sharing the same node set. Each layer included an edges term, a concurrent term (capturing overlapping partnerships, the structural feature central to generalised HIV epidemics), and two structural constraints: (1) heterosexual mixing, imposed via an offset nodematch(“sex”) term with coefficient −∞; and (2) age-disparate mixing, imposed via an absdiff term on a directional preferred-partner age (female age shifted upward by a fixed gap), so that AGYW preferentially partnered with older men. The mixing breadth was set so that AGYW partners were on average ~7.7 years older, with ~34% of AGYW partnerships involving men aged ≥30 years, consistent with South African age-disparate (“blesser”) partnership data. Mean partnership degree was informed by the Clover/Aimee cohort (mean 1.71 sexual partners in the past year). Vital dynamics comprised aging, entry of new susceptible 15-year-olds, and exit by background mortality, AIDS mortality, and aging out at age 50.</w:t>
+        <w:t>The model simulated a closed sexually-active population aged 15–50 years. Partnerships were represented as two concurrent dynamic networks — main (longer-duration, higher per-act frequency) and casual (shorter-duration) — each estimated as a separate temporal exponential-family random graph model (TERGM) sharing the same node set. Each layer included an edges term, a concurrent term (capturing overlapping partnerships, the structural feature central to generalised HIV epidemics), and two structural constraints: (1) heterosexual mixing, imposed via an offset nodematch(“sex”) term with coefficient −∞; and (2) age-disparate mixing, imposed via an absdiff term on a directional preferred-partner age (female age shifted upward by a fixed gap), so that AGYW preferentially partnered with older men. The mixing breadth was set so that AGYW partners were on average ~7.7 years older, with ~34% of AGYW partnerships involving men aged ≥30 years, consistent with South African age-disparate (“blesser”) partnership data. Mean partnership degree was informed by the Clover/Aimee cohort (mean 1.71 sexual partners in the past year), with main and casual partnerships of approximately 200- and 26-week mean duration.</w:t>
+      </w:r>
+    </w:p>
+    <w:p>
+      <w:r>
+        <w:rPr>
+          <w:i w:val="0"/>
+        </w:rPr>
+        <w:t>The model operated on a weekly time step over a closed sexually-active population aged 15–50 years. Demographic turnover comprised three processes. (i) Entry: each week, new susceptible individuals entered at age 15 as a Poisson draw with mean equal to the active population multiplied by an arrival rate of 0.0010 per week (≈5% per year), with sex assigned at a 1:1 ratio. (ii) Mortality and exit: all non-AIDS individuals departed at a background rate of 0.0005 per week (≈2.6% per year); AIDS-stage individuals departed at an elevated rate of 1/104 per week (≈2-year mean survival untreated), reduced 10-fold (multiplier 0.1) for those on suppressive ART. (iii) Aging out: individuals deterministically left the sexually-active population at age 50. Because per-capita entry slightly exceeded background exit, the population grew modestly over time, consistent with South Africa's young, expanding demographic structure. The two partnership networks and the age-disparate mixing structure were re-simulated each step to reflect updated ages. These demographic rates were not fit to vital statistics but set to maintain a stable-to-growing age structure during the HIV-free burn-in.</w:t>
       </w:r>
     </w:p>
     <w:p>
@@ -277,7 +285,7 @@
         <w:rPr>
           <w:i w:val="0"/>
         </w:rPr>
-        <w:t>HIV progression was modelled as susceptible → acute → chronic → AIDS, with stage-specific relative infectiousness (acute 5×, AIDS 2× the chronic reference). Per-partnership transmission each weekly time step was a function of a per-act transmission probability, the number of sex acts (5/week main, 2/week casual), infector stage, and ART status (treatment-as-prevention: virally suppressed individuals near-non-infectious). Young women carried an age-graded elevated per-contact susceptibility (2.0× at ages 15–19 and 1.5× at 20–24).</w:t>
+        <w:t>HIV progression was modelled as susceptible → acute → chronic → AIDS. The acute stage lasted a mean of 12 weeks (rate 1/12 per week), the chronic stage a mean of ~10 years (1/520 per week); untreated AIDS survival averaged ~2 years. Suppressive ART halved disease progression (multiplier 0.5) and extended AIDS survival ~10-fold (0.1). Infectiousness was stage-specific: relative to the chronic reference, the acute stage was 5× and the AIDS stage 2× as infectious; individuals on ART but not yet suppressed had relative infectiousness 0.30, and the virally suppressed 0.01 (near-non-infectious; treatment-as-prevention). Per-partnership transmission each weekly time step was computed from a per-act transmission probability (calibrated to 0.0035), the number of sex acts (5/week main, 2/week casual), the infector's stage and ART status, and — on the susceptible side — PrEP status and an age-graded elevated per-contact susceptibility for young women (2.0× at ages 15–19 and 1.5× at 20–24).</w:t>
       </w:r>
     </w:p>
     <w:p>
@@ -285,7 +293,15 @@
         <w:rPr>
           <w:i w:val="0"/>
         </w:rPr>
-        <w:t>The care cascade comprised four states — undiagnosed, diagnosed (off ART), on ART (not suppressed), and virally suppressed — with transitions governed by HIV testing/diagnosis, linkage, viral suppression, and ART discontinuation rates. ART availability was introduced as a time-varying scale-up ramping from 0 (pre-2004) to full (2014), reproducing the South African roll-out. PrEP was modelled on the susceptible side as a per-act reduction in acquisition probability (95% efficacy), with stochastic initiation among eligible individuals and discontinuation. The PrEP discontinuation rate was set to reflect the documented poor continuation of oral PrEP among South African AGYW (≈6-month median retention), so that baseline PrEP coverage remained low (~3%) with rapid turnover rather than accumulating an unrealistically protected stock.</w:t>
+        <w:t>The care cascade comprised four states — undiagnosed, diagnosed (off ART), on ART (not suppressed), and virally suppressed. Each week, undiagnosed individuals were diagnosed at a routine HIV-testing rate of 0.01 per week (≈41% per year; 0.05 per week at the symptomatic AIDS stage); diagnosed individuals linked to ART at 0.50 per week (re-initiation after a lapse at 0.10); ART-treated individuals achieved viral suppression at 0.30 per week; and treated individuals discontinued ART at 0.01 per week. ART availability was introduced as a time-varying scale-up: the linkage, re-initiation, and suppression rates were multiplied by a factor rising linearly from 0 (pre-2004) to 1 (from 2014), reproducing the South African roll-out.</w:t>
+      </w:r>
+    </w:p>
+    <w:p>
+      <w:r>
+        <w:rPr>
+          <w:i w:val="0"/>
+        </w:rPr>
+        <w:t>PrEP was modelled on the susceptible side as a 95% per-act reduction in acquisition probability. Individuals became PrEP-indicated if they had a partnership degree ≥ 2, an HIV-positive partner, or (for reached AGYW from 2025) were designated priority-population eligible. Indicated susceptibles initiated PrEP at 0.005 per week and discontinued at 0.027 per week — a median time on PrEP of ~6 months, set to reflect the documented poor continuation of oral PrEP among South African AGYW, so that baseline PrEP coverage remained low (~3%) with rapid turnover rather than accumulating an unrealistically protected stock. The full set of parameter values is given in Supplementary Table S1.</w:t>
       </w:r>
     </w:p>
     <w:p>

</xml_diff>

<commit_message>
Add intervention scenario-grid table to Methods; renumber tables sequentially
Add Table 1 (intervention scenario grid: testing/PrEP rate ratios by causal
fraction, crossed with reach) to the Methods in METHODS.md and the .docx.
Renumber downstream tables so the assembled manuscript runs 1 (grid) -> 2
(cascade) -> 3 (averted) -> 4 (persistence) -> S1/S2, and sync RESULTS.md
figure/table references to the final .docx scheme (calibration=Fig 1,
averted=Fig 2/Table 3, mechanism=Fig 4, persistence=Fig 5/Table 4).
</commit_message>
<xml_diff>
--- a/Aimee_AGYW_HIV_manuscript.docx
+++ b/Aimee_AGYW_HIV_manuscript.docx
@@ -522,9 +522,255 @@
         <w:rPr>
           <w:i w:val="0"/>
         </w:rPr>
-        <w:t>The Aimee chatbot was represented not mechanistically but as a perturbation of the two behavioural parameters it affects, applied to the subset of AGYW reached, from 2025 onward. Each woman was designated an Aimee user at cohort entry with probability equal to the scenario reach; while she was AGYW (15–24) and from 2025, her HIV-testing rate was multiplied by a testing rate ratio and her PrEP initiation rate by a PrEP rate ratio (with reached AGYW also rendered PrEP-eligible, consistent with their priority-population status). Rate ratios were derived from the Clover hazard ratios scaled by an assumed causal fraction: rate ratio = 1 + (HR − 1) × causal fraction. We evaluated a full factorial grid of reach (10%, 30%, 50% of AGYW) × causal fraction (25% [conservative], 50% [central], 100% [optimistic]), plus a no-chatbot counterfactual baseline.</w:t>
+        <w:t>The Aimee chatbot was represented not mechanistically but as a perturbation of the two behavioural parameters it affects, applied to the subset of AGYW reached, from 2025 onward. Each woman was designated an Aimee user at cohort entry with probability equal to the scenario reach; while she was AGYW (15–24) and from 2025, her HIV-testing rate was multiplied by a testing rate ratio and her PrEP initiation rate by a PrEP rate ratio (with reached AGYW also rendered PrEP-eligible, consistent with their priority-population status). Rate ratios were derived from the Clover hazard ratios (HR 2.11 for testing, 2.22 for PrEP) scaled by an assumed causal fraction: rate ratio = 1 + (HR − 1) × causal fraction. We evaluated a full factorial grid of reach (10%, 30%, 50% of AGYW) × causal fraction (Table 1), plus a no-chatbot counterfactual baseline — ten scenarios in total.</w:t>
       </w:r>
     </w:p>
+    <w:p>
+      <w:r>
+        <w:rPr>
+          <w:b/>
+          <w:sz w:val="20"/>
+        </w:rPr>
+        <w:t>Table 1. Intervention scenario grid. Rate ratios applied to the HIV-testing and PrEP-initiation rates of reached AGYW, by causal fraction; each crossed with the three reach levels (3 × 3 factorial) plus a no-chatbot baseline.</w:t>
+      </w:r>
+    </w:p>
+    <w:tbl>
+      <w:tblPr>
+        <w:tblStyle w:val="LightGrid-Accent1"/>
+        <w:tblW w:type="auto" w:w="0"/>
+        <w:jc w:val="center"/>
+        <w:tblLook w:firstColumn="1" w:firstRow="1" w:lastColumn="0" w:lastRow="0" w:noHBand="0" w:noVBand="1" w:val="04A0"/>
+      </w:tblPr>
+      <w:tblGrid>
+        <w:gridCol w:w="2880"/>
+        <w:gridCol w:w="2880"/>
+        <w:gridCol w:w="2880"/>
+      </w:tblGrid>
+      <w:tr>
+        <w:tc>
+          <w:tcPr>
+            <w:tcW w:type="dxa" w:w="3456"/>
+          </w:tcPr>
+          <w:p>
+            <w:r/>
+            <w:r>
+              <w:rPr>
+                <w:b/>
+                <w:sz w:val="18"/>
+              </w:rPr>
+              <w:t>Causal fraction</w:t>
+            </w:r>
+          </w:p>
+        </w:tc>
+        <w:tc>
+          <w:tcPr>
+            <w:tcW w:type="dxa" w:w="3024"/>
+          </w:tcPr>
+          <w:p>
+            <w:r/>
+            <w:r>
+              <w:rPr>
+                <w:b/>
+                <w:sz w:val="18"/>
+              </w:rPr>
+              <w:t>HIV-testing rate ratio</w:t>
+            </w:r>
+          </w:p>
+        </w:tc>
+        <w:tc>
+          <w:tcPr>
+            <w:tcW w:type="dxa" w:w="3024"/>
+          </w:tcPr>
+          <w:p>
+            <w:r/>
+            <w:r>
+              <w:rPr>
+                <w:b/>
+                <w:sz w:val="18"/>
+              </w:rPr>
+              <w:t>PrEP-initiation rate ratio</w:t>
+            </w:r>
+          </w:p>
+        </w:tc>
+      </w:tr>
+      <w:tr>
+        <w:tc>
+          <w:tcPr>
+            <w:tcW w:type="dxa" w:w="3456"/>
+          </w:tcPr>
+          <w:p>
+            <w:r/>
+            <w:r>
+              <w:rPr>
+                <w:sz w:val="18"/>
+              </w:rPr>
+              <w:t>Conservative (25% of HR causal)</w:t>
+            </w:r>
+          </w:p>
+        </w:tc>
+        <w:tc>
+          <w:tcPr>
+            <w:tcW w:type="dxa" w:w="3024"/>
+          </w:tcPr>
+          <w:p>
+            <w:r/>
+            <w:r>
+              <w:rPr>
+                <w:sz w:val="18"/>
+              </w:rPr>
+              <w:t>1.28</w:t>
+            </w:r>
+          </w:p>
+        </w:tc>
+        <w:tc>
+          <w:tcPr>
+            <w:tcW w:type="dxa" w:w="3024"/>
+          </w:tcPr>
+          <w:p>
+            <w:r/>
+            <w:r>
+              <w:rPr>
+                <w:sz w:val="18"/>
+              </w:rPr>
+              <w:t>1.31</w:t>
+            </w:r>
+          </w:p>
+        </w:tc>
+      </w:tr>
+      <w:tr>
+        <w:tc>
+          <w:tcPr>
+            <w:tcW w:type="dxa" w:w="3456"/>
+          </w:tcPr>
+          <w:p>
+            <w:r/>
+            <w:r>
+              <w:rPr>
+                <w:sz w:val="18"/>
+              </w:rPr>
+              <w:t>Central (50% of HR causal)</w:t>
+            </w:r>
+          </w:p>
+        </w:tc>
+        <w:tc>
+          <w:tcPr>
+            <w:tcW w:type="dxa" w:w="3024"/>
+          </w:tcPr>
+          <w:p>
+            <w:r/>
+            <w:r>
+              <w:rPr>
+                <w:sz w:val="18"/>
+              </w:rPr>
+              <w:t>1.55</w:t>
+            </w:r>
+          </w:p>
+        </w:tc>
+        <w:tc>
+          <w:tcPr>
+            <w:tcW w:type="dxa" w:w="3024"/>
+          </w:tcPr>
+          <w:p>
+            <w:r/>
+            <w:r>
+              <w:rPr>
+                <w:sz w:val="18"/>
+              </w:rPr>
+              <w:t>1.61</w:t>
+            </w:r>
+          </w:p>
+        </w:tc>
+      </w:tr>
+      <w:tr>
+        <w:tc>
+          <w:tcPr>
+            <w:tcW w:type="dxa" w:w="3456"/>
+          </w:tcPr>
+          <w:p>
+            <w:r/>
+            <w:r>
+              <w:rPr>
+                <w:sz w:val="18"/>
+              </w:rPr>
+              <w:t>Optimistic (100% of HR causal)</w:t>
+            </w:r>
+          </w:p>
+        </w:tc>
+        <w:tc>
+          <w:tcPr>
+            <w:tcW w:type="dxa" w:w="3024"/>
+          </w:tcPr>
+          <w:p>
+            <w:r/>
+            <w:r>
+              <w:rPr>
+                <w:sz w:val="18"/>
+              </w:rPr>
+              <w:t>2.11</w:t>
+            </w:r>
+          </w:p>
+        </w:tc>
+        <w:tc>
+          <w:tcPr>
+            <w:tcW w:type="dxa" w:w="3024"/>
+          </w:tcPr>
+          <w:p>
+            <w:r/>
+            <w:r>
+              <w:rPr>
+                <w:sz w:val="18"/>
+              </w:rPr>
+              <w:t>2.22</w:t>
+            </w:r>
+          </w:p>
+        </w:tc>
+      </w:tr>
+      <w:tr>
+        <w:tc>
+          <w:tcPr>
+            <w:tcW w:type="dxa" w:w="3456"/>
+          </w:tcPr>
+          <w:p>
+            <w:r/>
+            <w:r>
+              <w:rPr>
+                <w:sz w:val="18"/>
+              </w:rPr>
+              <w:t>crossed with reach →</w:t>
+            </w:r>
+          </w:p>
+        </w:tc>
+        <w:tc>
+          <w:tcPr>
+            <w:tcW w:type="dxa" w:w="3024"/>
+          </w:tcPr>
+          <w:p>
+            <w:r/>
+            <w:r>
+              <w:rPr>
+                <w:sz w:val="18"/>
+              </w:rPr>
+              <w:t>10% / 30% / 50% of AGYW</w:t>
+            </w:r>
+          </w:p>
+        </w:tc>
+        <w:tc>
+          <w:tcPr>
+            <w:tcW w:type="dxa" w:w="3024"/>
+          </w:tcPr>
+          <w:p>
+            <w:r/>
+            <w:r>
+              <w:rPr>
+                <w:sz w:val="18"/>
+              </w:rPr>
+              <w:t>+ no-chatbot baseline</w:t>
+            </w:r>
+          </w:p>
+        </w:tc>
+      </w:tr>
+    </w:tbl>
+    <w:p/>
     <w:p>
       <w:pPr>
         <w:pStyle w:val="Heading2"/>
@@ -624,7 +870,7 @@
           <w:b/>
           <w:sz w:val="20"/>
         </w:rPr>
-        <w:t>Table 1. Model care cascade vs South African estimates, 2022 (% of HIV-positive in group).</w:t>
+        <w:t>Table 2. Model care cascade vs South African estimates, 2022 (% of HIV-positive in group).</w:t>
       </w:r>
     </w:p>
     <w:tbl>
@@ -949,7 +1195,7 @@
         <w:rPr>
           <w:i w:val="0"/>
         </w:rPr>
-        <w:t>In the no-chatbot counterfactual, the model projected approximately 733,000 new HIV infections among AGYW nationally over 2025–2035 (median; interquartile range 696,000–762,000). This baseline incorporates realistic oral-PrEP discontinuation (≈6-month median retention), so baseline PrEP coverage remained low (~3%, consistent with South African estimates) with rapid turnover. Introducing the chatbot in 2025 reduced this burden, with impact increasing monotonically with both reach and the assumed causal fraction of the observed engagement effect (Figure 2; Table 2).</w:t>
+        <w:t>In the no-chatbot counterfactual, the model projected approximately 733,000 new HIV infections among AGYW nationally over 2025–2035 (median; interquartile range 696,000–762,000). This baseline incorporates realistic oral-PrEP discontinuation (≈6-month median retention), so baseline PrEP coverage remained low (~3%, consistent with South African estimates) with rapid turnover. Introducing the chatbot in 2025 reduced this burden, with impact increasing monotonically with both reach and the assumed causal fraction of the observed engagement effect (Figure 2; Table 3).</w:t>
       </w:r>
     </w:p>
     <w:p>
@@ -992,7 +1238,7 @@
           <w:b/>
           <w:sz w:val="20"/>
         </w:rPr>
-        <w:t>Table 2. AGYW HIV infections averted by the Aimee chatbot, 2025–2035.</w:t>
+        <w:t>Table 3. AGYW HIV infections averted by the Aimee chatbot, 2025–2035.</w:t>
       </w:r>
     </w:p>
     <w:tbl>
@@ -1964,7 +2210,7 @@
         <w:rPr>
           <w:i w:val="0"/>
         </w:rPr>
-        <w:t>A secondary analysis decomposed the 50%-reach effect into demand generation, persistence support, and their combination (Figure 5; Table 3). Demand generation alone — the primary-analysis mechanism — averted 5.8% of AGYW infections (43,192; 95% CI 25,852–60,531) and raised PrEP coverage from ~3% to ~11%, but coverage plateaued as initiated women continuously discontinued. Persistence support alone, which recruited no new users, averted 1.0% (not significant), 3.7% (p = 0.009), and 5.1% (p &lt; 0.001) of infections at a 20%, 40%, and 60% reduction in discontinuation — approaching the impact of demand generation at the strongest assumption, despite barely changing overall PrEP coverage (≤3.2%). This efficiency arises because persistence support concentrates protection on the clinically-eligible, higher-risk women already on PrEP, extending their protected time rather than diluting coverage across lower-risk new initiators.</w:t>
+        <w:t>A secondary analysis decomposed the 50%-reach effect into demand generation, persistence support, and their combination (Figure 5; Table 4). Demand generation alone — the primary-analysis mechanism — averted 5.8% of AGYW infections (43,192; 95% CI 25,852–60,531) and raised PrEP coverage from ~3% to ~11%, but coverage plateaued as initiated women continuously discontinued. Persistence support alone, which recruited no new users, averted 1.0% (not significant), 3.7% (p = 0.009), and 5.1% (p &lt; 0.001) of infections at a 20%, 40%, and 60% reduction in discontinuation — approaching the impact of demand generation at the strongest assumption, despite barely changing overall PrEP coverage (≤3.2%). This efficiency arises because persistence support concentrates protection on the clinically-eligible, higher-risk women already on PrEP, extending their protected time rather than diluting coverage across lower-risk new initiators.</w:t>
       </w:r>
     </w:p>
     <w:p>
@@ -1981,7 +2227,7 @@
           <w:b/>
           <w:sz w:val="20"/>
         </w:rPr>
-        <w:t>Table 3. PrEP delivery strategy — demand vs persistence (50% reach, central initiation).</w:t>
+        <w:t>Table 4. PrEP delivery strategy — demand vs persistence (50% reach, central initiation).</w:t>
       </w:r>
     </w:p>
     <w:tbl>

</xml_diff>

<commit_message>
Add verified citations to parameter table and references
Replace placeholder reference list with 27 verified citations (PMIDs/DOIs
checked): per-act transmission (Boily 2009, Hughes 2012), stage infectiousness
(Wawer 2005, Hollingsworth 2008), TasP (HPTN 052 Cohen 2011/2016, Quinn 2000,
Donnell 2010), PrEP efficacy (iPrEx, Partners PrEP, HPTN 084), PrEP continuation
(HPTN 082 Celum 2021), AGYW age-disparate partnerships (Maughan-Brown 2014,
Stoner/HPTN 068 2019), coital frequency (Delva 2013), concurrency (Morris 1997,
Goodreau 2012), SA ART rollout (Johnson 2012), Thembisa v5.0, EpiModel/statnet.
Map each Table S1 parameter to its citation(s); add footnotes flagging the
main-coital-frequency / partnership-duration assumptions and the HPTN 082
12-month-vs-6-month-median caveat. Update REFERENCES.md, SUPPLEMENT, and .docx.
</commit_message>
<xml_diff>
--- a/Aimee_AGYW_HIV_manuscript.docx
+++ b/Aimee_AGYW_HIV_manuscript.docx
@@ -3076,7 +3076,7 @@
         <w:rPr>
           <w:sz w:val="20"/>
         </w:rPr>
-        <w:t>1. [Clover/Aimee field study] — authors' own field-study manuscript/report providing the cohort, engagement, HIV-testing and PrEP-uptake data and effect sizes. [Complete citation.]</w:t>
+        <w:t>1. [Clover/Aimee field study] — authors' own field-study manuscript/report providing the cohort, engagement, HIV-testing and PrEP-uptake data, partnership degree, and effect sizes (HR 2.11 testing, 2.22 PrEP; analytic N = 9,310). [Complete citation; must be citable for submission.]</w:t>
       </w:r>
     </w:p>
     <w:p>
@@ -3087,7 +3087,7 @@
         <w:rPr>
           <w:sz w:val="20"/>
         </w:rPr>
-        <w:t>2. Jenness SM, Goodreau SM, Morris M. EpiModel: An R Package for Mathematical Modeling of Infectious Disease over Networks. J Stat Softw. 2018;84(8):1–47.</w:t>
+        <w:t>2. Jenness SM, Goodreau SM, Morris M. EpiModel: an R package for mathematical modeling of infectious disease over networks. J Stat Softw. 2018;84(8):1–47. PMID 29731699.</w:t>
       </w:r>
     </w:p>
     <w:p>
@@ -3098,7 +3098,7 @@
         <w:rPr>
           <w:sz w:val="20"/>
         </w:rPr>
-        <w:t>3. Morris M, Kretzschmar M. Concurrent partnerships and the spread of HIV. AIDS. 1997;11(5):641–648.</w:t>
+        <w:t>3. Handcock MS, Hunter DR, Butts CT, Goodreau SM, Morris M. statnet: software tools for the representation, visualization, analysis and simulation of network data. J Stat Softw. 2008;24(1). PMID 18618019.</w:t>
       </w:r>
     </w:p>
     <w:p>
@@ -3120,7 +3120,7 @@
         <w:rPr>
           <w:sz w:val="20"/>
         </w:rPr>
-        <w:t>5. Handcock MS, Hunter DR, Butts CT, Goodreau SM, Morris M. statnet: Software tools for the representation, visualization, analysis and simulation of network data. J Stat Softw. 2008;24(1).</w:t>
+        <w:t>5. Morris M, Kretzschmar M. Concurrent partnerships and the spread of HIV. AIDS. 1997;11(5):641–648. PMID 9108946.</w:t>
       </w:r>
     </w:p>
     <w:p>
@@ -3131,7 +3131,7 @@
         <w:rPr>
           <w:sz w:val="20"/>
         </w:rPr>
-        <w:t>6. Johnson LF, Dorrington RE. Thembisa version 5.0: A model for evaluating the impact of HIV/AIDS in South Africa. University of Cape Town; 2024. https://www.thembisa.org.</w:t>
+        <w:t>6. Goodreau SM, Cassels S, Kasprzyk D, et al. Concurrent partnerships, acute infection and HIV epidemic dynamics among young adults in Zimbabwe. AIDS Behav. 2012;16(2):312–322. PMID 21190074.</w:t>
       </w:r>
     </w:p>
     <w:p>
@@ -3142,7 +3142,7 @@
         <w:rPr>
           <w:sz w:val="20"/>
         </w:rPr>
-        <w:t>7. Human Sciences Research Council. The Sixth South African National HIV Prevalence, Incidence, Behaviour and Communication Survey (SABSSM VI), 2022. HSRC; 2023.</w:t>
+        <w:t>7. Boily MC, Baggaley RF, Wang L, et al. Heterosexual risk of HIV-1 infection per sexual act: systematic review and meta-analysis of observational studies. Lancet Infect Dis. 2009;9(2):118–129. PMID 19179227.</w:t>
       </w:r>
     </w:p>
     <w:p>
@@ -3153,7 +3153,7 @@
         <w:rPr>
           <w:sz w:val="20"/>
         </w:rPr>
-        <w:t>8. Maughan-Brown B, Kenyon C, Lurie MN. Partner age differences and concurrency in South Africa: Implications for HIV-infection risk among young women. AIDS Behav. 2014;18(12):2469–2476.</w:t>
+        <w:t>8. Hughes JP, Baeten JM, Lingappa JR, et al. Determinants of per-coital-act HIV-1 infectivity among African HIV-1-serodiscordant couples. J Infect Dis. 2012;205(3):358–365. PMID 22241800.</w:t>
       </w:r>
     </w:p>
     <w:p>
@@ -3164,7 +3164,7 @@
         <w:rPr>
           <w:sz w:val="20"/>
         </w:rPr>
-        <w:t>9. [HPTN 068] Age-disparate partnerships and incident HIV infection in adolescent girls and young women in rural South Africa. AIDS. 2019;33(1).</w:t>
+        <w:t>9. Wawer MJ, Gray RH, Sewankambo NK, et al. Rates of HIV-1 transmission per coital act, by stage of HIV-1 infection, in Rakai, Uganda. J Infect Dis. 2005;191(9):1403–1409. PMID 15809897.</w:t>
       </w:r>
     </w:p>
     <w:p>
@@ -3175,7 +3175,7 @@
         <w:rPr>
           <w:sz w:val="20"/>
         </w:rPr>
-        <w:t>10. [EMOD-HIV western Kenya] Health and economic impact of oral PrEP provision across subgroups in western Kenya: a modelling analysis. 2025. [PubMed 39800385.]</w:t>
+        <w:t>10. Hollingsworth TD, Anderson RM, Fraser C. HIV-1 transmission, by stage of infection. J Infect Dis. 2008;198(5):687–693. PMID 18662132.</w:t>
       </w:r>
     </w:p>
     <w:p>
@@ -3186,7 +3186,7 @@
         <w:rPr>
           <w:sz w:val="20"/>
         </w:rPr>
-        <w:t>11. EpiModel PrEP intervention studies (initiation/adherence/persistence; percent infections averted). EpiModel/PrEP-Optimize and related publications.</w:t>
+        <w:t>11. Cohen MS, Chen YQ, McCauley M, et al.; HPTN 052 Study Team. Prevention of HIV-1 infection with early antiretroviral therapy. N Engl J Med. 2011;365(6):493–505. PMID 21767103.</w:t>
       </w:r>
     </w:p>
     <w:p>
@@ -3197,7 +3197,7 @@
         <w:rPr>
           <w:sz w:val="20"/>
         </w:rPr>
-        <w:t>12. Noise-free comparison of stochastic agent-based simulations using common random numbers. 2024. arXiv:2409.02086.</w:t>
+        <w:t>12. Cohen MS, Chen YQ, McCauley M, et al.; HPTN 052 Study Team. Antiretroviral therapy for the prevention of HIV-1 transmission. N Engl J Med. 2016;375(9):830–839. PMID 27424812.</w:t>
       </w:r>
     </w:p>
     <w:p>
@@ -3208,7 +3208,7 @@
         <w:rPr>
           <w:sz w:val="20"/>
         </w:rPr>
-        <w:t>13. [PrEP efficacy] — relevant oral TDF/FTC or injectable cabotegravir/lenacapavir trial for the per-act efficacy assumption. [Complete citation.]</w:t>
+        <w:t>13. Quinn TC, Wawer MJ, Sewankambo N, et al. Viral load and heterosexual transmission of HIV type 1. N Engl J Med. 2000;342(13):921–929. PMID 10738050.</w:t>
       </w:r>
     </w:p>
     <w:p>
@@ -3219,7 +3219,150 @@
         <w:rPr>
           <w:sz w:val="20"/>
         </w:rPr>
-        <w:t>14. [ART treatment-as-prevention] HPTN 052 or equivalent for the near-zero infectiousness of virally suppressed individuals. [Complete citation.]</w:t>
+        <w:t>14. Donnell D, Baeten JM, Kiarie J, et al. Heterosexual HIV-1 transmission after initiation of antiretroviral therapy. Lancet. 2010;375(9731):2092–2098. PMID 20537376.</w:t>
+      </w:r>
+    </w:p>
+    <w:p>
+      <w:pPr>
+        <w:ind w:left="432" w:hanging="432"/>
+      </w:pPr>
+      <w:r>
+        <w:rPr>
+          <w:sz w:val="20"/>
+        </w:rPr>
+        <w:t>15. Grant RM, Lama JR, Anderson PL, et al.; iPrEx Study Team. Preexposure chemoprophylaxis for HIV prevention in men who have sex with men. N Engl J Med. 2010;363(27):2587–2599. PMID 21091279.</w:t>
+      </w:r>
+    </w:p>
+    <w:p>
+      <w:pPr>
+        <w:ind w:left="432" w:hanging="432"/>
+      </w:pPr>
+      <w:r>
+        <w:rPr>
+          <w:sz w:val="20"/>
+        </w:rPr>
+        <w:t>16. Baeten JM, Donnell D, Ndase P, et al.; Partners PrEP Study Team. Antiretroviral prophylaxis for HIV prevention in heterosexual men and women. N Engl J Med. 2012;367(5):399–410. PMID 22784037.</w:t>
+      </w:r>
+    </w:p>
+    <w:p>
+      <w:pPr>
+        <w:ind w:left="432" w:hanging="432"/>
+      </w:pPr>
+      <w:r>
+        <w:rPr>
+          <w:sz w:val="20"/>
+        </w:rPr>
+        <w:t>17. Delany-Moretlwe S, Hughes JP, Bock P, et al.; HPTN 084 study group. Cabotegravir for the prevention of HIV-1 in women: results from HPTN 084. Lancet. 2022;399(10337):1779–1789. PMID 35378077.</w:t>
+      </w:r>
+    </w:p>
+    <w:p>
+      <w:pPr>
+        <w:ind w:left="432" w:hanging="432"/>
+      </w:pPr>
+      <w:r>
+        <w:rPr>
+          <w:sz w:val="20"/>
+        </w:rPr>
+        <w:t>18. Celum C, Hosek S, Tsholwana M, et al. PrEP uptake, persistence, adherence, and effect of retrospective drug-level feedback on PrEP adherence among young women in southern Africa (HPTN 082). PLoS Med. 2021;18(6):e1003670. PMID 34143779.</w:t>
+      </w:r>
+    </w:p>
+    <w:p>
+      <w:pPr>
+        <w:ind w:left="432" w:hanging="432"/>
+      </w:pPr>
+      <w:r>
+        <w:rPr>
+          <w:sz w:val="20"/>
+        </w:rPr>
+        <w:t>19. Dellar RC, Dlamini S, Abdool Karim Q. Adolescent girls and young women: key populations for HIV epidemic control. J Int AIDS Soc. 2015;18(2 Suppl 1):19408. PMID 25724504.</w:t>
+      </w:r>
+    </w:p>
+    <w:p>
+      <w:pPr>
+        <w:ind w:left="432" w:hanging="432"/>
+      </w:pPr>
+      <w:r>
+        <w:rPr>
+          <w:sz w:val="20"/>
+        </w:rPr>
+        <w:t>20. Maughan-Brown B, Kenyon C, Lurie MN. Partner age differences and concurrency in South Africa: implications for HIV-infection risk among young women. AIDS Behav. 2014;18(12):2469–2476. PMID 25047687.</w:t>
+      </w:r>
+    </w:p>
+    <w:p>
+      <w:pPr>
+        <w:ind w:left="432" w:hanging="432"/>
+      </w:pPr>
+      <w:r>
+        <w:rPr>
+          <w:sz w:val="20"/>
+        </w:rPr>
+        <w:t>21. Stoner MCD, Nguyen N, Kilburn K, et al. Age-disparate partnerships and incident HIV infection in adolescent girls and young women in rural South Africa (HPTN 068). AIDS. 2019;33(1):83–91. PMID 30289813.</w:t>
+      </w:r>
+    </w:p>
+    <w:p>
+      <w:pPr>
+        <w:ind w:left="432" w:hanging="432"/>
+      </w:pPr>
+      <w:r>
+        <w:rPr>
+          <w:sz w:val="20"/>
+        </w:rPr>
+        <w:t>22. Delva W, Meng F, Beauclair R, et al. Coital frequency and condom use in monogamous and concurrent sexual relationships in Cape Town, South Africa. J Int AIDS Soc. 2013;16(1):18034. PMID 23618365.</w:t>
+      </w:r>
+    </w:p>
+    <w:p>
+      <w:pPr>
+        <w:ind w:left="432" w:hanging="432"/>
+      </w:pPr>
+      <w:r>
+        <w:rPr>
+          <w:sz w:val="20"/>
+        </w:rPr>
+        <w:t>23. Johnson LF. Access to antiretroviral treatment in South Africa, 2004–2011. South Afr J HIV Med. 2012;13(1):22–27.</w:t>
+      </w:r>
+    </w:p>
+    <w:p>
+      <w:pPr>
+        <w:ind w:left="432" w:hanging="432"/>
+      </w:pPr>
+      <w:r>
+        <w:rPr>
+          <w:sz w:val="20"/>
+        </w:rPr>
+        <w:t>24. Johnson LF, Dorrington RE. Thembisa version 5.0: a model for evaluating the impact of HIV/AIDS in South Africa. University of Cape Town; 2024. thembisa.org. [Pin the exact version used.]</w:t>
+      </w:r>
+    </w:p>
+    <w:p>
+      <w:pPr>
+        <w:ind w:left="432" w:hanging="432"/>
+      </w:pPr>
+      <w:r>
+        <w:rPr>
+          <w:sz w:val="20"/>
+        </w:rPr>
+        <w:t>25. Human Sciences Research Council. The Sixth South African National HIV Prevalence, Incidence, Behaviour and Communication Survey (SABSSM VI), 2022. HSRC; 2023.</w:t>
+      </w:r>
+    </w:p>
+    <w:p>
+      <w:pPr>
+        <w:ind w:left="432" w:hanging="432"/>
+      </w:pPr>
+      <w:r>
+        <w:rPr>
+          <w:sz w:val="20"/>
+        </w:rPr>
+        <w:t>26. [EMOD-HIV western Kenya] Health and economic impact of oral PrEP provision across subgroups in western Kenya: a modelling analysis. 2025. [PubMed 39800385 — complete citation.]</w:t>
+      </w:r>
+    </w:p>
+    <w:p>
+      <w:pPr>
+        <w:ind w:left="432" w:hanging="432"/>
+      </w:pPr>
+      <w:r>
+        <w:rPr>
+          <w:sz w:val="20"/>
+        </w:rPr>
+        <w:t>27. Noise-free comparison of stochastic agent-based simulations using common random numbers. 2024. arXiv:2409.02086. [Or a peer-reviewed CRN reference.]</w:t>
       </w:r>
     </w:p>
     <w:p>
@@ -3570,7 +3713,7 @@
       <w:tr>
         <w:tc>
           <w:tcPr>
-            <w:tcW w:type="dxa" w:w="3744"/>
+            <w:tcW w:type="dxa" w:w="3600"/>
           </w:tcPr>
           <w:p>
             <w:r/>
@@ -3585,7 +3728,7 @@
         </w:tc>
         <w:tc>
           <w:tcPr>
-            <w:tcW w:type="dxa" w:w="2160"/>
+            <w:tcW w:type="dxa" w:w="1872"/>
           </w:tcPr>
           <w:p>
             <w:r/>
@@ -3600,7 +3743,7 @@
         </w:tc>
         <w:tc>
           <w:tcPr>
-            <w:tcW w:type="dxa" w:w="3600"/>
+            <w:tcW w:type="dxa" w:w="4032"/>
           </w:tcPr>
           <w:p>
             <w:r/>
@@ -3617,7 +3760,7 @@
       <w:tr>
         <w:tc>
           <w:tcPr>
-            <w:tcW w:type="dxa" w:w="3744"/>
+            <w:tcW w:type="dxa" w:w="3600"/>
           </w:tcPr>
           <w:p>
             <w:r/>
@@ -3631,7 +3774,7 @@
         </w:tc>
         <w:tc>
           <w:tcPr>
-            <w:tcW w:type="dxa" w:w="2160"/>
+            <w:tcW w:type="dxa" w:w="1872"/>
           </w:tcPr>
           <w:p>
             <w:r/>
@@ -3645,7 +3788,7 @@
         </w:tc>
         <w:tc>
           <w:tcPr>
-            <w:tcW w:type="dxa" w:w="3600"/>
+            <w:tcW w:type="dxa" w:w="4032"/>
           </w:tcPr>
           <w:p>
             <w:r/>
@@ -3653,7 +3796,7 @@
               <w:rPr>
                 <w:sz w:val="18"/>
               </w:rPr>
-              <w:t>Calibrated to SA trajectory</w:t>
+              <w:t>Calibrated; range [7, 8]</w:t>
             </w:r>
           </w:p>
         </w:tc>
@@ -3661,7 +3804,7 @@
       <w:tr>
         <w:tc>
           <w:tcPr>
-            <w:tcW w:type="dxa" w:w="3744"/>
+            <w:tcW w:type="dxa" w:w="3600"/>
           </w:tcPr>
           <w:p>
             <w:r/>
@@ -3675,7 +3818,7 @@
         </w:tc>
         <w:tc>
           <w:tcPr>
-            <w:tcW w:type="dxa" w:w="2160"/>
+            <w:tcW w:type="dxa" w:w="1872"/>
           </w:tcPr>
           <w:p>
             <w:r/>
@@ -3689,7 +3832,7 @@
         </w:tc>
         <w:tc>
           <w:tcPr>
-            <w:tcW w:type="dxa" w:w="3600"/>
+            <w:tcW w:type="dxa" w:w="4032"/>
           </w:tcPr>
           <w:p>
             <w:r/>
@@ -3697,7 +3840,7 @@
               <w:rPr>
                 <w:sz w:val="18"/>
               </w:rPr>
-              <w:t>Calibrated (plausible range)</w:t>
+              <w:t>Casual ≈2/wk [22]; main assumption ᵃ</w:t>
             </w:r>
           </w:p>
         </w:tc>
@@ -3705,7 +3848,7 @@
       <w:tr>
         <w:tc>
           <w:tcPr>
-            <w:tcW w:type="dxa" w:w="3744"/>
+            <w:tcW w:type="dxa" w:w="3600"/>
           </w:tcPr>
           <w:p>
             <w:r/>
@@ -3719,7 +3862,7 @@
         </w:tc>
         <w:tc>
           <w:tcPr>
-            <w:tcW w:type="dxa" w:w="2160"/>
+            <w:tcW w:type="dxa" w:w="1872"/>
           </w:tcPr>
           <w:p>
             <w:r/>
@@ -3733,7 +3876,7 @@
         </w:tc>
         <w:tc>
           <w:tcPr>
-            <w:tcW w:type="dxa" w:w="3600"/>
+            <w:tcW w:type="dxa" w:w="4032"/>
           </w:tcPr>
           <w:p>
             <w:r/>
@@ -3741,7 +3884,7 @@
               <w:rPr>
                 <w:sz w:val="18"/>
               </w:rPr>
-              <w:t>Literature</w:t>
+              <w:t>Literature [9, 10]</w:t>
             </w:r>
           </w:p>
         </w:tc>
@@ -3749,7 +3892,7 @@
       <w:tr>
         <w:tc>
           <w:tcPr>
-            <w:tcW w:type="dxa" w:w="3744"/>
+            <w:tcW w:type="dxa" w:w="3600"/>
           </w:tcPr>
           <w:p>
             <w:r/>
@@ -3763,7 +3906,7 @@
         </w:tc>
         <w:tc>
           <w:tcPr>
-            <w:tcW w:type="dxa" w:w="2160"/>
+            <w:tcW w:type="dxa" w:w="1872"/>
           </w:tcPr>
           <w:p>
             <w:r/>
@@ -3777,7 +3920,7 @@
         </w:tc>
         <w:tc>
           <w:tcPr>
-            <w:tcW w:type="dxa" w:w="3600"/>
+            <w:tcW w:type="dxa" w:w="4032"/>
           </w:tcPr>
           <w:p>
             <w:r/>
@@ -3785,7 +3928,7 @@
               <w:rPr>
                 <w:sz w:val="18"/>
               </w:rPr>
-              <w:t>Literature (TasP)</w:t>
+              <w:t>TasP [11, 12, 13, 14]</w:t>
             </w:r>
           </w:p>
         </w:tc>
@@ -3793,7 +3936,7 @@
       <w:tr>
         <w:tc>
           <w:tcPr>
-            <w:tcW w:type="dxa" w:w="3744"/>
+            <w:tcW w:type="dxa" w:w="3600"/>
           </w:tcPr>
           <w:p>
             <w:r/>
@@ -3807,7 +3950,7 @@
         </w:tc>
         <w:tc>
           <w:tcPr>
-            <w:tcW w:type="dxa" w:w="2160"/>
+            <w:tcW w:type="dxa" w:w="1872"/>
           </w:tcPr>
           <w:p>
             <w:r/>
@@ -3821,7 +3964,7 @@
         </w:tc>
         <w:tc>
           <w:tcPr>
-            <w:tcW w:type="dxa" w:w="3600"/>
+            <w:tcW w:type="dxa" w:w="4032"/>
           </w:tcPr>
           <w:p>
             <w:r/>
@@ -3829,7 +3972,7 @@
               <w:rPr>
                 <w:sz w:val="18"/>
               </w:rPr>
-              <w:t>Literature</w:t>
+              <w:t>Young-women risk [19]</w:t>
             </w:r>
           </w:p>
         </w:tc>
@@ -3837,7 +3980,7 @@
       <w:tr>
         <w:tc>
           <w:tcPr>
-            <w:tcW w:type="dxa" w:w="3744"/>
+            <w:tcW w:type="dxa" w:w="3600"/>
           </w:tcPr>
           <w:p>
             <w:r/>
@@ -3851,7 +3994,7 @@
         </w:tc>
         <w:tc>
           <w:tcPr>
-            <w:tcW w:type="dxa" w:w="2160"/>
+            <w:tcW w:type="dxa" w:w="1872"/>
           </w:tcPr>
           <w:p>
             <w:r/>
@@ -3865,7 +4008,7 @@
         </w:tc>
         <w:tc>
           <w:tcPr>
-            <w:tcW w:type="dxa" w:w="3600"/>
+            <w:tcW w:type="dxa" w:w="4032"/>
           </w:tcPr>
           <w:p>
             <w:r/>
@@ -3873,7 +4016,7 @@
               <w:rPr>
                 <w:sz w:val="18"/>
               </w:rPr>
-              <w:t>Literature</w:t>
+              <w:t>High-adherence oral/injectable [15, 16, 17]</w:t>
             </w:r>
           </w:p>
         </w:tc>
@@ -3881,7 +4024,7 @@
       <w:tr>
         <w:tc>
           <w:tcPr>
-            <w:tcW w:type="dxa" w:w="3744"/>
+            <w:tcW w:type="dxa" w:w="3600"/>
           </w:tcPr>
           <w:p>
             <w:r/>
@@ -3895,7 +4038,7 @@
         </w:tc>
         <w:tc>
           <w:tcPr>
-            <w:tcW w:type="dxa" w:w="2160"/>
+            <w:tcW w:type="dxa" w:w="1872"/>
           </w:tcPr>
           <w:p>
             <w:r/>
@@ -3909,7 +4052,7 @@
         </w:tc>
         <w:tc>
           <w:tcPr>
-            <w:tcW w:type="dxa" w:w="3600"/>
+            <w:tcW w:type="dxa" w:w="4032"/>
           </w:tcPr>
           <w:p>
             <w:r/>
@@ -3917,7 +4060,7 @@
               <w:rPr>
                 <w:sz w:val="18"/>
               </w:rPr>
-              <w:t>Aimee cohort (≈1.71 past-year partners)</w:t>
+              <w:t>Aimee cohort (≈1.71 partners) [1]</w:t>
             </w:r>
           </w:p>
         </w:tc>
@@ -3925,7 +4068,7 @@
       <w:tr>
         <w:tc>
           <w:tcPr>
-            <w:tcW w:type="dxa" w:w="3744"/>
+            <w:tcW w:type="dxa" w:w="3600"/>
           </w:tcPr>
           <w:p>
             <w:r/>
@@ -3939,7 +4082,7 @@
         </w:tc>
         <w:tc>
           <w:tcPr>
-            <w:tcW w:type="dxa" w:w="2160"/>
+            <w:tcW w:type="dxa" w:w="1872"/>
           </w:tcPr>
           <w:p>
             <w:r/>
@@ -3953,7 +4096,7 @@
         </w:tc>
         <w:tc>
           <w:tcPr>
-            <w:tcW w:type="dxa" w:w="3600"/>
+            <w:tcW w:type="dxa" w:w="4032"/>
           </w:tcPr>
           <w:p>
             <w:r/>
@@ -3961,7 +4104,7 @@
               <w:rPr>
                 <w:sz w:val="18"/>
               </w:rPr>
-              <w:t>Bounded by mean degree</w:t>
+              <w:t>Bounded by degree [5, 6]</w:t>
             </w:r>
           </w:p>
         </w:tc>
@@ -3969,7 +4112,7 @@
       <w:tr>
         <w:tc>
           <w:tcPr>
-            <w:tcW w:type="dxa" w:w="3744"/>
+            <w:tcW w:type="dxa" w:w="3600"/>
           </w:tcPr>
           <w:p>
             <w:r/>
@@ -3983,7 +4126,7 @@
         </w:tc>
         <w:tc>
           <w:tcPr>
-            <w:tcW w:type="dxa" w:w="2160"/>
+            <w:tcW w:type="dxa" w:w="1872"/>
           </w:tcPr>
           <w:p>
             <w:r/>
@@ -3997,7 +4140,7 @@
         </w:tc>
         <w:tc>
           <w:tcPr>
-            <w:tcW w:type="dxa" w:w="3600"/>
+            <w:tcW w:type="dxa" w:w="4032"/>
           </w:tcPr>
           <w:p>
             <w:r/>
@@ -4005,7 +4148,7 @@
               <w:rPr>
                 <w:sz w:val="18"/>
               </w:rPr>
-              <w:t>AGYW partner gap ≈7.7y; 34% men ≥30</w:t>
+              <w:t>Realised AGYW gap ≈7.7y; 34% men ≥30 [20, 21]</w:t>
             </w:r>
           </w:p>
         </w:tc>
@@ -4013,7 +4156,7 @@
       <w:tr>
         <w:tc>
           <w:tcPr>
-            <w:tcW w:type="dxa" w:w="3744"/>
+            <w:tcW w:type="dxa" w:w="3600"/>
           </w:tcPr>
           <w:p>
             <w:r/>
@@ -4027,7 +4170,7 @@
         </w:tc>
         <w:tc>
           <w:tcPr>
-            <w:tcW w:type="dxa" w:w="2160"/>
+            <w:tcW w:type="dxa" w:w="1872"/>
           </w:tcPr>
           <w:p>
             <w:r/>
@@ -4041,7 +4184,7 @@
         </w:tc>
         <w:tc>
           <w:tcPr>
-            <w:tcW w:type="dxa" w:w="3600"/>
+            <w:tcW w:type="dxa" w:w="4032"/>
           </w:tcPr>
           <w:p>
             <w:r/>
@@ -4049,7 +4192,7 @@
               <w:rPr>
                 <w:sz w:val="18"/>
               </w:rPr>
-              <w:t>SA age-disparate literature</w:t>
+              <w:t>SA age-disparate literature [20, 21]</w:t>
             </w:r>
           </w:p>
         </w:tc>
@@ -4057,7 +4200,7 @@
       <w:tr>
         <w:tc>
           <w:tcPr>
-            <w:tcW w:type="dxa" w:w="3744"/>
+            <w:tcW w:type="dxa" w:w="3600"/>
           </w:tcPr>
           <w:p>
             <w:r/>
@@ -4071,7 +4214,7 @@
         </w:tc>
         <w:tc>
           <w:tcPr>
-            <w:tcW w:type="dxa" w:w="2160"/>
+            <w:tcW w:type="dxa" w:w="1872"/>
           </w:tcPr>
           <w:p>
             <w:r/>
@@ -4085,7 +4228,7 @@
         </w:tc>
         <w:tc>
           <w:tcPr>
-            <w:tcW w:type="dxa" w:w="3600"/>
+            <w:tcW w:type="dxa" w:w="4032"/>
           </w:tcPr>
           <w:p>
             <w:r/>
@@ -4093,7 +4236,7 @@
               <w:rPr>
                 <w:sz w:val="18"/>
               </w:rPr>
-              <w:t>Literature</w:t>
+              <w:t>Modelling assumption (cf. [6]) ᵃ</w:t>
             </w:r>
           </w:p>
         </w:tc>
@@ -4101,7 +4244,7 @@
       <w:tr>
         <w:tc>
           <w:tcPr>
-            <w:tcW w:type="dxa" w:w="3744"/>
+            <w:tcW w:type="dxa" w:w="3600"/>
           </w:tcPr>
           <w:p>
             <w:r/>
@@ -4115,7 +4258,7 @@
         </w:tc>
         <w:tc>
           <w:tcPr>
-            <w:tcW w:type="dxa" w:w="2160"/>
+            <w:tcW w:type="dxa" w:w="1872"/>
           </w:tcPr>
           <w:p>
             <w:r/>
@@ -4129,7 +4272,7 @@
         </w:tc>
         <w:tc>
           <w:tcPr>
-            <w:tcW w:type="dxa" w:w="3600"/>
+            <w:tcW w:type="dxa" w:w="4032"/>
           </w:tcPr>
           <w:p>
             <w:r/>
@@ -4137,7 +4280,7 @@
               <w:rPr>
                 <w:sz w:val="18"/>
               </w:rPr>
-              <w:t>Calibrated/literature</w:t>
+              <w:t>Reference model; validated vs SA cascade</w:t>
             </w:r>
           </w:p>
         </w:tc>
@@ -4145,7 +4288,7 @@
       <w:tr>
         <w:tc>
           <w:tcPr>
-            <w:tcW w:type="dxa" w:w="3744"/>
+            <w:tcW w:type="dxa" w:w="3600"/>
           </w:tcPr>
           <w:p>
             <w:r/>
@@ -4159,7 +4302,7 @@
         </w:tc>
         <w:tc>
           <w:tcPr>
-            <w:tcW w:type="dxa" w:w="2160"/>
+            <w:tcW w:type="dxa" w:w="1872"/>
           </w:tcPr>
           <w:p>
             <w:r/>
@@ -4173,7 +4316,7 @@
         </w:tc>
         <w:tc>
           <w:tcPr>
-            <w:tcW w:type="dxa" w:w="3600"/>
+            <w:tcW w:type="dxa" w:w="4032"/>
           </w:tcPr>
           <w:p>
             <w:r/>
@@ -4181,7 +4324,7 @@
               <w:rPr>
                 <w:sz w:val="18"/>
               </w:rPr>
-              <w:t>Cascade</w:t>
+              <w:t>Reference model; validated vs SA cascade</w:t>
             </w:r>
           </w:p>
         </w:tc>
@@ -4189,7 +4332,7 @@
       <w:tr>
         <w:tc>
           <w:tcPr>
-            <w:tcW w:type="dxa" w:w="3744"/>
+            <w:tcW w:type="dxa" w:w="3600"/>
           </w:tcPr>
           <w:p>
             <w:r/>
@@ -4203,7 +4346,7 @@
         </w:tc>
         <w:tc>
           <w:tcPr>
-            <w:tcW w:type="dxa" w:w="2160"/>
+            <w:tcW w:type="dxa" w:w="1872"/>
           </w:tcPr>
           <w:p>
             <w:r/>
@@ -4217,7 +4360,7 @@
         </w:tc>
         <w:tc>
           <w:tcPr>
-            <w:tcW w:type="dxa" w:w="3600"/>
+            <w:tcW w:type="dxa" w:w="4032"/>
           </w:tcPr>
           <w:p>
             <w:r/>
@@ -4225,7 +4368,7 @@
               <w:rPr>
                 <w:sz w:val="18"/>
               </w:rPr>
-              <w:t>Cascade</w:t>
+              <w:t>Reference model; validated vs SA cascade</w:t>
             </w:r>
           </w:p>
         </w:tc>
@@ -4233,7 +4376,7 @@
       <w:tr>
         <w:tc>
           <w:tcPr>
-            <w:tcW w:type="dxa" w:w="3744"/>
+            <w:tcW w:type="dxa" w:w="3600"/>
           </w:tcPr>
           <w:p>
             <w:r/>
@@ -4247,7 +4390,7 @@
         </w:tc>
         <w:tc>
           <w:tcPr>
-            <w:tcW w:type="dxa" w:w="2160"/>
+            <w:tcW w:type="dxa" w:w="1872"/>
           </w:tcPr>
           <w:p>
             <w:r/>
@@ -4261,7 +4404,7 @@
         </w:tc>
         <w:tc>
           <w:tcPr>
-            <w:tcW w:type="dxa" w:w="3600"/>
+            <w:tcW w:type="dxa" w:w="4032"/>
           </w:tcPr>
           <w:p>
             <w:r/>
@@ -4269,7 +4412,7 @@
               <w:rPr>
                 <w:sz w:val="18"/>
               </w:rPr>
-              <w:t>Cascade</w:t>
+              <w:t>Reference model</w:t>
             </w:r>
           </w:p>
         </w:tc>
@@ -4277,7 +4420,7 @@
       <w:tr>
         <w:tc>
           <w:tcPr>
-            <w:tcW w:type="dxa" w:w="3744"/>
+            <w:tcW w:type="dxa" w:w="3600"/>
           </w:tcPr>
           <w:p>
             <w:r/>
@@ -4291,7 +4434,7 @@
         </w:tc>
         <w:tc>
           <w:tcPr>
-            <w:tcW w:type="dxa" w:w="2160"/>
+            <w:tcW w:type="dxa" w:w="1872"/>
           </w:tcPr>
           <w:p>
             <w:r/>
@@ -4305,7 +4448,7 @@
         </w:tc>
         <w:tc>
           <w:tcPr>
-            <w:tcW w:type="dxa" w:w="3600"/>
+            <w:tcW w:type="dxa" w:w="4032"/>
           </w:tcPr>
           <w:p>
             <w:r/>
@@ -4313,7 +4456,7 @@
               <w:rPr>
                 <w:sz w:val="18"/>
               </w:rPr>
-              <w:t>SA roll-out</w:t>
+              <w:t>SA roll-out [23]</w:t>
             </w:r>
           </w:p>
         </w:tc>
@@ -4321,7 +4464,7 @@
       <w:tr>
         <w:tc>
           <w:tcPr>
-            <w:tcW w:type="dxa" w:w="3744"/>
+            <w:tcW w:type="dxa" w:w="3600"/>
           </w:tcPr>
           <w:p>
             <w:r/>
@@ -4335,7 +4478,7 @@
         </w:tc>
         <w:tc>
           <w:tcPr>
-            <w:tcW w:type="dxa" w:w="2160"/>
+            <w:tcW w:type="dxa" w:w="1872"/>
           </w:tcPr>
           <w:p>
             <w:r/>
@@ -4349,7 +4492,7 @@
         </w:tc>
         <w:tc>
           <w:tcPr>
-            <w:tcW w:type="dxa" w:w="3600"/>
+            <w:tcW w:type="dxa" w:w="4032"/>
           </w:tcPr>
           <w:p>
             <w:r/>
@@ -4357,7 +4500,7 @@
               <w:rPr>
                 <w:sz w:val="18"/>
               </w:rPr>
-              <w:t>Literature</w:t>
+              <w:t>Modelling assumption</w:t>
             </w:r>
           </w:p>
         </w:tc>
@@ -4365,7 +4508,7 @@
       <w:tr>
         <w:tc>
           <w:tcPr>
-            <w:tcW w:type="dxa" w:w="3744"/>
+            <w:tcW w:type="dxa" w:w="3600"/>
           </w:tcPr>
           <w:p>
             <w:r/>
@@ -4379,7 +4522,7 @@
         </w:tc>
         <w:tc>
           <w:tcPr>
-            <w:tcW w:type="dxa" w:w="2160"/>
+            <w:tcW w:type="dxa" w:w="1872"/>
           </w:tcPr>
           <w:p>
             <w:r/>
@@ -4393,7 +4536,7 @@
         </w:tc>
         <w:tc>
           <w:tcPr>
-            <w:tcW w:type="dxa" w:w="3600"/>
+            <w:tcW w:type="dxa" w:w="4032"/>
           </w:tcPr>
           <w:p>
             <w:r/>
@@ -4401,7 +4544,7 @@
               <w:rPr>
                 <w:sz w:val="18"/>
               </w:rPr>
-              <w:t>≈6-mo median retention (SA oral PrEP)</w:t>
+              <w:t>≈6-mo median retention [18] ᵇ</w:t>
             </w:r>
           </w:p>
         </w:tc>
@@ -4409,7 +4552,7 @@
       <w:tr>
         <w:tc>
           <w:tcPr>
-            <w:tcW w:type="dxa" w:w="3744"/>
+            <w:tcW w:type="dxa" w:w="3600"/>
           </w:tcPr>
           <w:p>
             <w:r/>
@@ -4423,7 +4566,7 @@
         </w:tc>
         <w:tc>
           <w:tcPr>
-            <w:tcW w:type="dxa" w:w="2160"/>
+            <w:tcW w:type="dxa" w:w="1872"/>
           </w:tcPr>
           <w:p>
             <w:r/>
@@ -4437,7 +4580,51 @@
         </w:tc>
         <w:tc>
           <w:tcPr>
+            <w:tcW w:type="dxa" w:w="4032"/>
+          </w:tcPr>
+          <w:p>
+            <w:r/>
+            <w:r>
+              <w:rPr>
+                <w:sz w:val="18"/>
+              </w:rPr>
+              <w:t>Calibration setup; Thembisa [24]</w:t>
+            </w:r>
+          </w:p>
+        </w:tc>
+      </w:tr>
+      <w:tr>
+        <w:tc>
+          <w:tcPr>
             <w:tcW w:type="dxa" w:w="3600"/>
+          </w:tcPr>
+          <w:p>
+            <w:r/>
+            <w:r>
+              <w:rPr>
+                <w:sz w:val="18"/>
+              </w:rPr>
+              <w:t>Demographic burn-in</w:t>
+            </w:r>
+          </w:p>
+        </w:tc>
+        <w:tc>
+          <w:tcPr>
+            <w:tcW w:type="dxa" w:w="1872"/>
+          </w:tcPr>
+          <w:p>
+            <w:r/>
+            <w:r>
+              <w:rPr>
+                <w:sz w:val="18"/>
+              </w:rPr>
+              <w:t>1965–1990 (HIV-free)</w:t>
+            </w:r>
+          </w:p>
+        </w:tc>
+        <w:tc>
+          <w:tcPr>
+            <w:tcW w:type="dxa" w:w="4032"/>
           </w:tcPr>
           <w:p>
             <w:r/>
@@ -4453,51 +4640,7 @@
       <w:tr>
         <w:tc>
           <w:tcPr>
-            <w:tcW w:type="dxa" w:w="3744"/>
-          </w:tcPr>
-          <w:p>
-            <w:r/>
-            <w:r>
-              <w:rPr>
-                <w:sz w:val="18"/>
-              </w:rPr>
-              <w:t>Demographic burn-in</w:t>
-            </w:r>
-          </w:p>
-        </w:tc>
-        <w:tc>
-          <w:tcPr>
-            <w:tcW w:type="dxa" w:w="2160"/>
-          </w:tcPr>
-          <w:p>
-            <w:r/>
-            <w:r>
-              <w:rPr>
-                <w:sz w:val="18"/>
-              </w:rPr>
-              <w:t>1965–1990 (HIV-free)</w:t>
-            </w:r>
-          </w:p>
-        </w:tc>
-        <w:tc>
-          <w:tcPr>
             <w:tcW w:type="dxa" w:w="3600"/>
-          </w:tcPr>
-          <w:p>
-            <w:r/>
-            <w:r>
-              <w:rPr>
-                <w:sz w:val="18"/>
-              </w:rPr>
-              <w:t>Calibration setup</w:t>
-            </w:r>
-          </w:p>
-        </w:tc>
-      </w:tr>
-      <w:tr>
-        <w:tc>
-          <w:tcPr>
-            <w:tcW w:type="dxa" w:w="3744"/>
           </w:tcPr>
           <w:p>
             <w:r/>
@@ -4511,7 +4654,7 @@
         </w:tc>
         <w:tc>
           <w:tcPr>
-            <w:tcW w:type="dxa" w:w="2160"/>
+            <w:tcW w:type="dxa" w:w="1872"/>
           </w:tcPr>
           <w:p>
             <w:r/>
@@ -4525,7 +4668,7 @@
         </w:tc>
         <w:tc>
           <w:tcPr>
-            <w:tcW w:type="dxa" w:w="3600"/>
+            <w:tcW w:type="dxa" w:w="4032"/>
           </w:tcPr>
           <w:p>
             <w:r/>
@@ -4533,7 +4676,7 @@
               <w:rPr>
                 <w:sz w:val="18"/>
               </w:rPr>
-              <w:t>Thembisa 2022</w:t>
+              <w:t>Thembisa v5.0 [24]</w:t>
             </w:r>
           </w:p>
         </w:tc>
@@ -4541,7 +4684,7 @@
       <w:tr>
         <w:tc>
           <w:tcPr>
-            <w:tcW w:type="dxa" w:w="3744"/>
+            <w:tcW w:type="dxa" w:w="3600"/>
           </w:tcPr>
           <w:p>
             <w:r/>
@@ -4555,7 +4698,7 @@
         </w:tc>
         <w:tc>
           <w:tcPr>
-            <w:tcW w:type="dxa" w:w="2160"/>
+            <w:tcW w:type="dxa" w:w="1872"/>
           </w:tcPr>
           <w:p>
             <w:r/>
@@ -4569,7 +4712,7 @@
         </w:tc>
         <w:tc>
           <w:tcPr>
-            <w:tcW w:type="dxa" w:w="3600"/>
+            <w:tcW w:type="dxa" w:w="4032"/>
           </w:tcPr>
           <w:p>
             <w:r/>
@@ -4584,6 +4727,15 @@
       </w:tr>
     </w:tbl>
     <w:p/>
+    <w:p>
+      <w:r>
+        <w:rPr>
+          <w:i/>
+          <w:sz w:val="16"/>
+        </w:rPr>
+        <w:t>ᵃ Main-partner coital frequency (5/week) and partnership durations (200/26 weeks) are modelling assumptions within plausible ranges; empirical South African data support a casual frequency of ≈2 acts/week [22]. ᵇ The discontinuation rate corresponds to a ≈6-month median time on PrEP, presented as consistent with poor oral-PrEP continuation among South African AGYW [18] (HPTN 082 followed participants for 12 months, so this is the model's implied retention, not a directly measured median). Care-cascade transition rates were fixed a priori from the reference model — not tuned to any coverage target; only the ART-availability timing was imposed from SA's roll-out, so the model's reproduction of the observed cascade is an out-of-sample validation (Results).</w:t>
+      </w:r>
+    </w:p>
     <w:p>
       <w:pPr>
         <w:pStyle w:val="Heading2"/>

</xml_diff>

<commit_message>
Add in-text citations to Methods and Introduction prose
Insert the verified reference numbers into the body text (not just Table S1):
EpiModel/statnet/R [2-4]; concurrency/generalised epidemics [5,6]; age-disparate
partnerships [20,21]; Aimee degree [1]; stage infectiousness [9,10]; TasP
[11-14]; per-act transmission range [7,8]; AGYW susceptibility [19]; PrEP
efficacy [15-17]; ART roll-out [23]; oral-PrEP continuation [18]; Thembisa [24];
plus Introduction epidemiology claims.
</commit_message>
<xml_diff>
--- a/Aimee_AGYW_HIV_manuscript.docx
+++ b/Aimee_AGYW_HIV_manuscript.docx
@@ -192,7 +192,7 @@
         <w:rPr>
           <w:i w:val="0"/>
         </w:rPr>
-        <w:t>Adolescent girls and young women (AGYW, aged 15–24 years) in sub-Saharan Africa acquire HIV at two to three times the rate of their male peers, and South Africa carries one of the highest AGYW HIV burdens in the world. The drivers are well described: age-disparate partnerships with older men who have substantially higher HIV prevalence, biological susceptibility, concurrency within the partnership network, and structural barriers to prevention and care. Despite a large national ART programme and the availability of oral pre-exposure prophylaxis (PrEP), AGYW continue to lag the rest of the population on the HIV care cascade and on PrEP coverage and continuation.</w:t>
+        <w:t>Adolescent girls and young women (AGYW, aged 15–24 years) in sub-Saharan Africa acquire HIV at two to three times the rate of their male peers, and South Africa carries one of the highest AGYW HIV burdens in the world [19]. The drivers are well described: age-disparate partnerships with older men who have substantially higher HIV prevalence, biological susceptibility, concurrency within the partnership network, and structural barriers to prevention and care [19, 20, 21]. Despite a large national ART programme and the availability of oral pre-exposure prophylaxis (PrEP), AGYW continue to lag the rest of the population on the HIV care cascade and on PrEP coverage and continuation.</w:t>
       </w:r>
     </w:p>
     <w:p>
@@ -200,7 +200,7 @@
         <w:rPr>
           <w:i w:val="0"/>
         </w:rPr>
-        <w:t>Pre-exposure prophylaxis is highly effective when taken, but among AGYW its real-world impact has been limited by low uptake and poor persistence: many young women who initiate oral PrEP discontinue within months. Interventions that raise both the demand for and the sustained use of testing and PrEP are therefore a priority. Mobile-phone–delivered digital health tools, and increasingly conversational AI “health companions,” offer a scalable channel for reaching young women with personalised, stigma-free information and navigation support.</w:t>
+        <w:t>Pre-exposure prophylaxis is highly effective when taken [15, 16], but among AGYW its real-world impact has been limited by low uptake and poor persistence: many young women who initiate oral PrEP discontinue within months [18]. Interventions that raise both the demand for and the sustained use of testing and PrEP are therefore a priority. Mobile-phone–delivered digital health tools, and increasingly conversational AI “health companions,” offer a scalable channel for reaching young women with personalised, stigma-free information and navigation support.</w:t>
       </w:r>
     </w:p>
     <w:p>
@@ -245,7 +245,7 @@
         <w:rPr>
           <w:i w:val="0"/>
         </w:rPr>
-        <w:t>We developed a stochastic, individual-based dynamic network model of heterosexual HIV transmission in South Africa to estimate the population-level impact of an AI health companion (Aimee) on HIV incidence among AGYW (women aged 15–24 years). The model was implemented in the EpiModel framework (v2.6.1) in R, building on the EpiModel Gallery “HIV Transmission with Care Cascade and PrEP” reference model, and extended with sex- and age-structured partnership networks, an age-disparate mixing structure, age-graded female susceptibility, and an intervention layer representing chatbot-driven changes to HIV testing and PrEP uptake. The model was calibrated to the South African HIV epidemic trajectory (1990–2022) and used to project AGYW HIV infections averted by the chatbot over 2025–2035 under a range of reach and effect-size assumptions.</w:t>
+        <w:t>We developed a stochastic, individual-based dynamic network model of heterosexual HIV transmission in South Africa to estimate the population-level impact of an AI health companion (Aimee) on HIV incidence among AGYW (women aged 15–24 years). The model was implemented in the EpiModel framework (v2.6.1) [2, 3] in R [4], building on the EpiModel Gallery “HIV Transmission with Care Cascade and PrEP” reference model, and extended with sex- and age-structured partnership networks, an age-disparate mixing structure, age-graded female susceptibility, and an intervention layer representing chatbot-driven changes to HIV testing and PrEP uptake. The model was calibrated to the South African HIV epidemic trajectory (1990–2022) and used to project AGYW HIV infections averted by the chatbot over 2025–2035 under a range of reach and effect-size assumptions.</w:t>
       </w:r>
     </w:p>
     <w:p>
@@ -261,7 +261,7 @@
         <w:rPr>
           <w:i w:val="0"/>
         </w:rPr>
-        <w:t>The model simulated a closed sexually-active population aged 15–50 years. Partnerships were represented as two concurrent dynamic networks — main (longer-duration, higher per-act frequency) and casual (shorter-duration) — each estimated as a separate temporal exponential-family random graph model (TERGM) sharing the same node set. Each layer included an edges term, a concurrent term (capturing overlapping partnerships, the structural feature central to generalised HIV epidemics), and two structural constraints: (1) heterosexual mixing, imposed via an offset nodematch(“sex”) term with coefficient −∞; and (2) age-disparate mixing, imposed via an absdiff term on a directional preferred-partner age (female age shifted upward by a fixed gap), so that AGYW preferentially partnered with older men. The mixing breadth was set so that AGYW partners were on average ~7.7 years older, with ~34% of AGYW partnerships involving men aged ≥30 years, consistent with South African age-disparate (“blesser”) partnership data. Mean partnership degree was informed by the Clover/Aimee cohort (mean 1.71 sexual partners in the past year), with main and casual partnerships of approximately 200- and 26-week mean duration.</w:t>
+        <w:t>The model simulated a closed sexually-active population aged 15–50 years. Partnerships were represented as two concurrent dynamic networks — main (longer-duration, higher per-act frequency) and casual (shorter-duration) — each estimated as a separate temporal exponential-family random graph model (TERGM) sharing the same node set. Each layer included an edges term, a concurrent term (capturing overlapping partnerships, the structural feature central to generalised HIV epidemics [5, 6]), and two structural constraints: (1) heterosexual mixing, imposed via an offset nodematch(“sex”) term with coefficient −∞; and (2) age-disparate mixing, imposed via an absdiff term on a directional preferred-partner age (female age shifted upward by a fixed gap), so that AGYW preferentially partnered with older men. The mixing breadth was set so that AGYW partners were on average ~7.7 years older, with ~34% of AGYW partnerships involving men aged ≥30 years, consistent with South African age-disparate (“blesser”) partnership data [20, 21]. Mean partnership degree was informed by the Clover/Aimee cohort (mean 1.71 sexual partners in the past year) [1], with main and casual partnerships of approximately 200- and 26-week mean duration.</w:t>
       </w:r>
     </w:p>
     <w:p>
@@ -285,7 +285,7 @@
         <w:rPr>
           <w:i w:val="0"/>
         </w:rPr>
-        <w:t>HIV progression was modelled as susceptible → acute → chronic → AIDS. The acute stage lasted a mean of 12 weeks (rate 1/12 per week), the chronic stage a mean of ~10 years (1/520 per week); untreated AIDS survival averaged ~2 years. Suppressive ART halved disease progression (multiplier 0.5) and extended AIDS survival ~10-fold (0.1). Infectiousness was stage-specific: relative to the chronic reference, the acute stage was 5× and the AIDS stage 2× as infectious; individuals on ART but not yet suppressed had relative infectiousness 0.30, and the virally suppressed 0.01 (near-non-infectious; treatment-as-prevention). Per-partnership transmission each weekly time step was computed from a per-act transmission probability (calibrated to 0.0035), the number of sex acts (5/week main, 2/week casual), the infector's stage and ART status, and — on the susceptible side — PrEP status and an age-graded elevated per-contact susceptibility for young women (2.0× at ages 15–19 and 1.5× at 20–24).</w:t>
+        <w:t>HIV progression was modelled as susceptible → acute → chronic → AIDS. The acute stage lasted a mean of 12 weeks (rate 1/12 per week), the chronic stage a mean of ~10 years (1/520 per week); untreated AIDS survival averaged ~2 years. Suppressive ART halved disease progression (multiplier 0.5) and extended AIDS survival ~10-fold (0.1). Infectiousness was stage-specific: relative to the chronic reference, the acute stage was 5× and the AIDS stage 2× as infectious [9, 10]; individuals on ART but not yet suppressed had relative infectiousness 0.30, and the virally suppressed 0.01 (near-non-infectious; treatment-as-prevention [11, 12, 13, 14]). Per-partnership transmission each weekly time step was computed from a per-act transmission probability (calibrated to 0.0035; within the range from per-act transmission studies [7, 8]), the number of sex acts (5/week main, 2/week casual), the infector's stage and ART status, and — on the susceptible side — PrEP status and an age-graded elevated per-contact susceptibility for young women (2.0× at ages 15–19 and 1.5× at 20–24 [19]).</w:t>
       </w:r>
     </w:p>
     <w:p>
@@ -293,7 +293,7 @@
         <w:rPr>
           <w:i w:val="0"/>
         </w:rPr>
-        <w:t>The care cascade comprised four states — undiagnosed, diagnosed (off ART), on ART (not suppressed), and virally suppressed. Each week, undiagnosed individuals were diagnosed at a routine HIV-testing rate of 0.01 per week (≈41% per year; 0.05 per week at the symptomatic AIDS stage); diagnosed individuals linked to ART at 0.50 per week (re-initiation after a lapse at 0.10); ART-treated individuals achieved viral suppression at 0.30 per week; and treated individuals discontinued ART at 0.01 per week. ART availability was introduced as a time-varying scale-up: the linkage, re-initiation, and suppression rates were multiplied by a factor rising linearly from 0 (pre-2004) to 1 (from 2014), reproducing the South African roll-out.</w:t>
+        <w:t>The care cascade comprised four states — undiagnosed, diagnosed (off ART), on ART (not suppressed), and virally suppressed. Each week, undiagnosed individuals were diagnosed at a routine HIV-testing rate of 0.01 per week (≈41% per year; 0.05 per week at the symptomatic AIDS stage); diagnosed individuals linked to ART at 0.50 per week (re-initiation after a lapse at 0.10); ART-treated individuals achieved viral suppression at 0.30 per week; and treated individuals discontinued ART at 0.01 per week. ART availability was introduced as a time-varying scale-up: the linkage, re-initiation, and suppression rates were multiplied by a factor rising linearly from 0 (pre-2004) to 1 (from 2014), reproducing the South African roll-out [23].</w:t>
       </w:r>
     </w:p>
     <w:p>
@@ -301,7 +301,7 @@
         <w:rPr>
           <w:i w:val="0"/>
         </w:rPr>
-        <w:t>PrEP was modelled on the susceptible side as a 95% per-act reduction in acquisition probability. Individuals became PrEP-indicated if they had a partnership degree ≥ 2, an HIV-positive partner, or (for reached AGYW from 2025) were designated priority-population eligible. Indicated susceptibles initiated PrEP at 0.005 per week and discontinued at 0.027 per week — a median time on PrEP of ~6 months, set to reflect the documented poor continuation of oral PrEP among South African AGYW, so that baseline PrEP coverage remained low (~3%) with rapid turnover rather than accumulating an unrealistically protected stock. The full set of parameter values is given in Supplementary Table S1.</w:t>
+        <w:t>PrEP was modelled on the susceptible side as a 95% per-act reduction in acquisition probability [15, 16, 17]. Individuals became PrEP-indicated if they had a partnership degree ≥ 2, an HIV-positive partner, or (for reached AGYW from 2025) were designated priority-population eligible. Indicated susceptibles initiated PrEP at 0.005 per week and discontinued at 0.027 per week — a median time on PrEP of ~6 months, set to reflect the documented poor continuation of oral PrEP among South African AGYW [18], so that baseline PrEP coverage remained low (~3%) with rapid turnover rather than accumulating an unrealistically protected stock. The full set of parameter values is given in Supplementary Table S1.</w:t>
       </w:r>
     </w:p>
     <w:p>
@@ -506,7 +506,7 @@
         <w:rPr>
           <w:i w:val="0"/>
         </w:rPr>
-        <w:t>The model was calibrated using the trajectory-fitting approach standard for South African HIV models, rather than to a single equilibrium cross-section. The simulation clock began in 1965 with a 25-year HIV-free demographic and network burn-in to allow the age structure and partnerships to reach stationarity. HIV was seeded in 1990 at 0.8% prevalence and simulated forward to 2022 with the time-varying ART scale-up. The free transmission parameter (per-act transmission probability) was fit so that the simulated prevalence and incidence trajectories reproduced the Thembisa v5.0 targets across 1990–2022. The best-fitting value (per-act probability 0.0035) yielded a trajectory root-mean-square error of 0.031; the calibrated model reproduced the rise, peak, and ART-era decline of the South African epidemic. Network degree, age gap, and young-women susceptibility were fixed from data/literature; ART-era cascade dynamics were calibrated jointly with transmission.</w:t>
+        <w:t>The model was calibrated using the trajectory-fitting approach standard for South African HIV models, rather than to a single equilibrium cross-section. The simulation clock began in 1965 with a 25-year HIV-free demographic and network burn-in to allow the age structure and partnerships to reach stationarity. HIV was seeded in 1990 at 0.8% prevalence and simulated forward to 2022 with the time-varying ART scale-up. The free transmission parameter (per-act transmission probability) was fit so that the simulated prevalence and incidence trajectories reproduced the Thembisa v5.0 targets [24] across 1990–2022. The best-fitting value (per-act probability 0.0035) yielded a trajectory root-mean-square error of 0.031; the calibrated model reproduced the rise, peak, and ART-era decline of the South African epidemic. Network degree, age gap, and young-women susceptibility were fixed from data/literature; ART-era cascade dynamics were calibrated jointly with transmission.</w:t>
       </w:r>
     </w:p>
     <w:p>

</xml_diff>